<commit_message>
docs: update scheduling guide for atomic rescheduling
Signed-off-by: Everett Williams <everett@medplum.com>
</commit_message>
<xml_diff>
--- a/packages/docs/static/decision-guides/scheduling.docx
+++ b/packages/docs/static/decision-guides/scheduling.docx
@@ -11,18 +11,18 @@
           <wp:inline>
             <wp:extent cx="5943600" cy="1289649"/>
             <wp:effectExtent b="0" l="0" r="0" t="0"/>
-            <wp:docPr descr="Medplum" title="" id="21" name="Picture"/>
+            <wp:docPr descr="Medplum" title="" id="10" name="Picture"/>
             <a:graphic>
               <a:graphicData uri="http://schemas.openxmlformats.org/drawingml/2006/picture">
                 <pic:pic>
                   <pic:nvPicPr>
-                    <pic:cNvPr descr="medplum-wordmark-grape.png" id="22" name="Picture"/>
+                    <pic:cNvPr descr="medplum-wordmark-grape.png" id="11" name="Picture"/>
                     <pic:cNvPicPr>
                       <a:picLocks noChangeArrowheads="1" noChangeAspect="1"/>
                     </pic:cNvPicPr>
                   </pic:nvPicPr>
                   <pic:blipFill>
-                    <a:blip r:embed="rId20"/>
+                    <a:blip r:embed="rId9"/>
                     <a:stretch>
                       <a:fillRect/>
                     </a:stretch>
@@ -49,7 +49,7 @@
         </w:drawing>
       </w:r>
     </w:p>
-    <w:bookmarkStart w:id="65" w:name="scheduling-decision-guide"/>
+    <w:bookmarkStart w:id="55" w:name="scheduling-decision-guide"/>
     <w:p>
       <w:pPr>
         <w:pStyle w:val="Heading1"/>
@@ -64,39 +64,39 @@
       </w:pPr>
       <w:r>
         <w:rPr>
+          <w:i/>
           <w:iCs/>
-          <w:i/>
         </w:rPr>
         <w:t xml:space="preserve">Companion to the</w:t>
       </w:r>
       <w:r>
         <w:rPr>
+          <w:i/>
           <w:iCs/>
-          <w:i/>
         </w:rPr>
         <w:t xml:space="preserve"> </w:t>
       </w:r>
-      <w:hyperlink r:id="rId23">
+      <w:hyperlink r:id="rId12">
         <w:r>
           <w:rPr>
             <w:rStyle w:val="Hyperlink"/>
+            <w:i/>
             <w:iCs/>
-            <w:i/>
           </w:rPr>
           <w:t xml:space="preserve">Scheduling</w:t>
         </w:r>
       </w:hyperlink>
       <w:r>
         <w:rPr>
+          <w:i/>
           <w:iCs/>
-          <w:i/>
         </w:rPr>
         <w:t xml:space="preserve"> </w:t>
       </w:r>
       <w:r>
         <w:rPr>
+          <w:i/>
           <w:iCs/>
-          <w:i/>
         </w:rPr>
         <w:t xml:space="preserve">docs.</w:t>
       </w:r>
@@ -119,7 +119,7 @@
       <w:r>
         <w:t xml:space="preserve"> </w:t>
       </w:r>
-      <w:hyperlink r:id="rId24">
+      <w:hyperlink r:id="rId13">
         <w:r>
           <w:rPr>
             <w:rStyle w:val="Hyperlink"/>
@@ -133,7 +133,7 @@
       <w:r>
         <w:t xml:space="preserve"> </w:t>
       </w:r>
-      <w:hyperlink r:id="rId25">
+      <w:hyperlink r:id="rId14">
         <w:r>
           <w:rPr>
             <w:rStyle w:val="Hyperlink"/>
@@ -148,7 +148,7 @@
         <w:t xml:space="preserve">when upgrading an existing implementation.</w:t>
       </w:r>
     </w:p>
-    <w:bookmarkStart w:id="26" w:name="section-1-use-case-participants"/>
+    <w:bookmarkStart w:id="15" w:name="section-1-use-case-participants"/>
     <w:p>
       <w:pPr>
         <w:pStyle w:val="Heading2"/>
@@ -163,67 +163,67 @@
       </w:pPr>
       <w:r>
         <w:rPr>
+          <w:b/>
           <w:bCs/>
-          <w:b/>
         </w:rPr>
         <w:t xml:space="preserve">1.1 Who books, and on whose behalf?</w:t>
       </w:r>
     </w:p>
     <w:p>
       <w:pPr>
+        <w:pStyle w:val="Compact"/>
         <w:numPr>
           <w:ilvl w:val="0"/>
           <w:numId w:val="1001"/>
         </w:numPr>
+      </w:pPr>
+      <w:r>
+        <w:t xml:space="preserve">Patient self-service</w:t>
+      </w:r>
+    </w:p>
+    <w:p>
+      <w:pPr>
         <w:pStyle w:val="Compact"/>
-      </w:pPr>
-      <w:r>
-        <w:t xml:space="preserve">Patient self-service</w:t>
-      </w:r>
-    </w:p>
-    <w:p>
-      <w:pPr>
         <w:numPr>
           <w:ilvl w:val="0"/>
           <w:numId w:val="1001"/>
         </w:numPr>
+      </w:pPr>
+      <w:r>
+        <w:t xml:space="preserve">Staff booking for a patient</w:t>
+      </w:r>
+    </w:p>
+    <w:p>
+      <w:pPr>
         <w:pStyle w:val="Compact"/>
-      </w:pPr>
-      <w:r>
-        <w:t xml:space="preserve">Staff booking for a patient</w:t>
-      </w:r>
-    </w:p>
-    <w:p>
-      <w:pPr>
         <w:numPr>
           <w:ilvl w:val="0"/>
           <w:numId w:val="1001"/>
         </w:numPr>
+      </w:pPr>
+      <w:r>
+        <w:t xml:space="preserve">Provider managing their own appointments</w:t>
+      </w:r>
+    </w:p>
+    <w:p>
+      <w:pPr>
         <w:pStyle w:val="Compact"/>
-      </w:pPr>
-      <w:r>
-        <w:t xml:space="preserve">Provider managing their own appointments</w:t>
-      </w:r>
-    </w:p>
-    <w:p>
-      <w:pPr>
         <w:numPr>
           <w:ilvl w:val="0"/>
           <w:numId w:val="1001"/>
         </w:numPr>
+      </w:pPr>
+      <w:r>
+        <w:t xml:space="preserve">System or API-driven booking</w:t>
+      </w:r>
+    </w:p>
+    <w:p>
+      <w:pPr>
         <w:pStyle w:val="Compact"/>
-      </w:pPr>
-      <w:r>
-        <w:t xml:space="preserve">System or API-driven booking</w:t>
-      </w:r>
-    </w:p>
-    <w:p>
-      <w:pPr>
         <w:numPr>
           <w:ilvl w:val="0"/>
           <w:numId w:val="1001"/>
         </w:numPr>
-        <w:pStyle w:val="Compact"/>
       </w:pPr>
       <w:r>
         <w:t xml:space="preserve">A combination of these</w:t>
@@ -235,8 +235,8 @@
       </w:pPr>
       <w:r>
         <w:rPr>
+          <w:i/>
           <w:iCs/>
-          <w:i/>
         </w:rPr>
         <w:t xml:space="preserve">Why: determines authentication, delegated access, and which users can change availability or make exceptions (3.4, 3.9).</w:t>
       </w:r>
@@ -247,67 +247,67 @@
       </w:pPr>
       <w:r>
         <w:rPr>
+          <w:b/>
           <w:bCs/>
-          <w:b/>
         </w:rPr>
         <w:t xml:space="preserve">1.2 What must be available for the appointment?</w:t>
       </w:r>
     </w:p>
     <w:p>
       <w:pPr>
+        <w:pStyle w:val="Compact"/>
         <w:numPr>
           <w:ilvl w:val="0"/>
           <w:numId w:val="1002"/>
         </w:numPr>
+      </w:pPr>
+      <w:r>
+        <w:t xml:space="preserve">A clinician only</w:t>
+      </w:r>
+    </w:p>
+    <w:p>
+      <w:pPr>
         <w:pStyle w:val="Compact"/>
-      </w:pPr>
-      <w:r>
-        <w:t xml:space="preserve">A clinician only</w:t>
-      </w:r>
-    </w:p>
-    <w:p>
-      <w:pPr>
         <w:numPr>
           <w:ilvl w:val="0"/>
           <w:numId w:val="1002"/>
         </w:numPr>
+      </w:pPr>
+      <w:r>
+        <w:t xml:space="preserve">Several concurrent resources, such as a clinician, room, and device</w:t>
+      </w:r>
+    </w:p>
+    <w:p>
+      <w:pPr>
         <w:pStyle w:val="Compact"/>
-      </w:pPr>
-      <w:r>
-        <w:t xml:space="preserve">Several concurrent resources, such as a clinician, room, and device</w:t>
-      </w:r>
-    </w:p>
-    <w:p>
-      <w:pPr>
         <w:numPr>
           <w:ilvl w:val="0"/>
           <w:numId w:val="1002"/>
         </w:numPr>
+      </w:pPr>
+      <w:r>
+        <w:t xml:space="preserve">A room or device without a clinician</w:t>
+      </w:r>
+    </w:p>
+    <w:p>
+      <w:pPr>
         <w:pStyle w:val="Compact"/>
-      </w:pPr>
-      <w:r>
-        <w:t xml:space="preserve">A room or device without a clinician</w:t>
-      </w:r>
-    </w:p>
-    <w:p>
-      <w:pPr>
         <w:numPr>
           <w:ilvl w:val="0"/>
           <w:numId w:val="1002"/>
         </w:numPr>
+      </w:pPr>
+      <w:r>
+        <w:t xml:space="preserve">A shared resource with capacity greater than one</w:t>
+      </w:r>
+    </w:p>
+    <w:p>
+      <w:pPr>
         <w:pStyle w:val="Compact"/>
-      </w:pPr>
-      <w:r>
-        <w:t xml:space="preserve">A shared resource with capacity greater than one</w:t>
-      </w:r>
-    </w:p>
-    <w:p>
-      <w:pPr>
         <w:numPr>
           <w:ilvl w:val="0"/>
           <w:numId w:val="1002"/>
         </w:numPr>
-        <w:pStyle w:val="Compact"/>
       </w:pPr>
       <w:r>
         <w:t xml:space="preserve">A group session with several patients</w:t>
@@ -319,8 +319,8 @@
       </w:pPr>
       <w:r>
         <w:rPr>
+          <w:i/>
           <w:iCs/>
-          <w:i/>
         </w:rPr>
         <w:t xml:space="preserve">Why: distinguishes multi-resource coordination from capacity and patient-specific workflow decisions (3.2, 3.6, 3.7).</w:t>
       </w:r>
@@ -331,55 +331,55 @@
       </w:pPr>
       <w:r>
         <w:rPr>
+          <w:b/>
           <w:bCs/>
-          <w:b/>
         </w:rPr>
         <w:t xml:space="preserve">1.3 Does the patient choose a person, or an eligible pool?</w:t>
       </w:r>
     </w:p>
     <w:p>
       <w:pPr>
+        <w:pStyle w:val="Compact"/>
         <w:numPr>
           <w:ilvl w:val="0"/>
           <w:numId w:val="1003"/>
         </w:numPr>
+      </w:pPr>
+      <w:r>
+        <w:t xml:space="preserve">A named practitioner or care team</w:t>
+      </w:r>
+    </w:p>
+    <w:p>
+      <w:pPr>
         <w:pStyle w:val="Compact"/>
-      </w:pPr>
-      <w:r>
-        <w:t xml:space="preserve">A named practitioner or care team</w:t>
-      </w:r>
-    </w:p>
-    <w:p>
-      <w:pPr>
         <w:numPr>
           <w:ilvl w:val="0"/>
           <w:numId w:val="1003"/>
         </w:numPr>
+      </w:pPr>
+      <w:r>
+        <w:t xml:space="preserve">Any practitioner qualified for the service</w:t>
+      </w:r>
+    </w:p>
+    <w:p>
+      <w:pPr>
         <w:pStyle w:val="Compact"/>
-      </w:pPr>
-      <w:r>
-        <w:t xml:space="preserve">Any practitioner qualified for the service</w:t>
-      </w:r>
-    </w:p>
-    <w:p>
-      <w:pPr>
         <w:numPr>
           <w:ilvl w:val="0"/>
           <w:numId w:val="1003"/>
         </w:numPr>
+      </w:pPr>
+      <w:r>
+        <w:t xml:space="preserve">First available, subject to preferences</w:t>
+      </w:r>
+    </w:p>
+    <w:p>
+      <w:pPr>
         <w:pStyle w:val="Compact"/>
-      </w:pPr>
-      <w:r>
-        <w:t xml:space="preserve">First available, subject to preferences</w:t>
-      </w:r>
-    </w:p>
-    <w:p>
-      <w:pPr>
         <w:numPr>
           <w:ilvl w:val="0"/>
           <w:numId w:val="1003"/>
         </w:numPr>
-        <w:pStyle w:val="Compact"/>
       </w:pPr>
       <w:r>
         <w:t xml:space="preserve">Staff assignment after a request</w:t>
@@ -391,109 +391,67 @@
       </w:pPr>
       <w:r>
         <w:rPr>
+          <w:i/>
           <w:iCs/>
-          <w:i/>
         </w:rPr>
-        <w:t xml:space="preserve">Why: determines candidate selection, hard eligibility rules, preference ranking, and what</w:t>
-      </w:r>
+        <w:t xml:space="preserve">Why: determines candidate selection, hard eligibility rules, preference ranking, and what “first available” promises (3.5, 3.6).</w:t>
+      </w:r>
+    </w:p>
+    <w:p>
+      <w:pPr>
+        <w:pStyle w:val="BodyText"/>
+      </w:pPr>
       <w:r>
         <w:rPr>
-          <w:iCs/>
-          <w:i/>
-        </w:rPr>
-        <w:t xml:space="preserve"> </w:t>
-      </w:r>
-      <w:r>
-        <w:rPr>
-          <w:iCs/>
-          <w:i/>
-        </w:rPr>
-        <w:t xml:space="preserve">“</w:t>
-      </w:r>
-      <w:r>
-        <w:rPr>
-          <w:iCs/>
-          <w:i/>
-        </w:rPr>
-        <w:t xml:space="preserve">first available</w:t>
-      </w:r>
-      <w:r>
-        <w:rPr>
-          <w:iCs/>
-          <w:i/>
-        </w:rPr>
-        <w:t xml:space="preserve">”</w:t>
-      </w:r>
-      <w:r>
-        <w:rPr>
-          <w:iCs/>
-          <w:i/>
-        </w:rPr>
-        <w:t xml:space="preserve"> </w:t>
-      </w:r>
-      <w:r>
-        <w:rPr>
-          <w:iCs/>
-          <w:i/>
-        </w:rPr>
-        <w:t xml:space="preserve">promises (3.5, 3.6).</w:t>
-      </w:r>
-    </w:p>
-    <w:p>
-      <w:pPr>
-        <w:pStyle w:val="BodyText"/>
-      </w:pPr>
-      <w:r>
-        <w:rPr>
+          <w:b/>
           <w:bCs/>
-          <w:b/>
         </w:rPr>
         <w:t xml:space="preserve">1.4 When is the appointment considered booked?</w:t>
       </w:r>
     </w:p>
     <w:p>
       <w:pPr>
+        <w:pStyle w:val="Compact"/>
         <w:numPr>
           <w:ilvl w:val="0"/>
           <w:numId w:val="1004"/>
         </w:numPr>
+      </w:pPr>
+      <w:r>
+        <w:t xml:space="preserve">Immediately after the time is selected</w:t>
+      </w:r>
+    </w:p>
+    <w:p>
+      <w:pPr>
         <w:pStyle w:val="Compact"/>
-      </w:pPr>
-      <w:r>
-        <w:t xml:space="preserve">Immediately after the time is selected</w:t>
-      </w:r>
-    </w:p>
-    <w:p>
-      <w:pPr>
         <w:numPr>
           <w:ilvl w:val="0"/>
           <w:numId w:val="1004"/>
         </w:numPr>
+      </w:pPr>
+      <w:r>
+        <w:t xml:space="preserve">After the patient completes another step</w:t>
+      </w:r>
+    </w:p>
+    <w:p>
+      <w:pPr>
         <w:pStyle w:val="Compact"/>
-      </w:pPr>
-      <w:r>
-        <w:t xml:space="preserve">After the patient completes another step</w:t>
-      </w:r>
-    </w:p>
-    <w:p>
-      <w:pPr>
         <w:numPr>
           <w:ilvl w:val="0"/>
           <w:numId w:val="1004"/>
         </w:numPr>
+      </w:pPr>
+      <w:r>
+        <w:t xml:space="preserve">After staff approval or authorization review</w:t>
+      </w:r>
+    </w:p>
+    <w:p>
+      <w:pPr>
         <w:pStyle w:val="Compact"/>
-      </w:pPr>
-      <w:r>
-        <w:t xml:space="preserve">After staff approval or authorization review</w:t>
-      </w:r>
-    </w:p>
-    <w:p>
-      <w:pPr>
         <w:numPr>
           <w:ilvl w:val="0"/>
           <w:numId w:val="1004"/>
         </w:numPr>
-        <w:pStyle w:val="Compact"/>
       </w:pPr>
       <w:r>
         <w:t xml:space="preserve">After required participants respond</w:t>
@@ -505,8 +463,8 @@
       </w:pPr>
       <w:r>
         <w:rPr>
+          <w:i/>
           <w:iCs/>
-          <w:i/>
         </w:rPr>
         <w:t xml:space="preserve">Why: determines whether to book immediately, reserve time with a hold, or keep a request without consuming capacity (3.8).</w:t>
       </w:r>
@@ -517,8 +475,8 @@
       </w:pPr>
       <w:r>
         <w:rPr>
+          <w:b/>
           <w:bCs/>
-          <w:b/>
         </w:rPr>
         <w:t xml:space="preserve">1.5 Is Medplum replacing a scheduler, or working alongside one?</w:t>
       </w:r>
@@ -537,39 +495,39 @@
       </w:pPr>
       <w:r>
         <w:rPr>
+          <w:i/>
           <w:iCs/>
-          <w:i/>
         </w:rPr>
         <w:t xml:space="preserve">Why: coexistence needs an explicit write authority and reconciliation policy. Existing scheduling data may also require a</w:t>
       </w:r>
       <w:r>
         <w:rPr>
+          <w:i/>
           <w:iCs/>
-          <w:i/>
         </w:rPr>
         <w:t xml:space="preserve"> </w:t>
       </w:r>
-      <w:hyperlink r:id="rId25">
+      <w:hyperlink r:id="rId14">
         <w:r>
           <w:rPr>
             <w:rStyle w:val="Hyperlink"/>
+            <w:i/>
             <w:iCs/>
-            <w:i/>
           </w:rPr>
           <w:t xml:space="preserve">beta migration</w:t>
         </w:r>
       </w:hyperlink>
       <w:r>
         <w:rPr>
+          <w:i/>
           <w:iCs/>
-          <w:i/>
         </w:rPr>
         <w:t xml:space="preserve"> </w:t>
       </w:r>
       <w:r>
         <w:rPr>
+          <w:i/>
           <w:iCs/>
-          <w:i/>
         </w:rPr>
         <w:t xml:space="preserve">(3.15).</w:t>
       </w:r>
@@ -580,8 +538,8 @@
       </w:pPr>
       <w:r>
         <w:rPr>
+          <w:b/>
           <w:bCs/>
-          <w:b/>
         </w:rPr>
         <w:t xml:space="preserve">1.6 Who maintains the scheduling configuration?</w:t>
       </w:r>
@@ -600,8 +558,8 @@
       </w:pPr>
       <w:r>
         <w:rPr>
+          <w:i/>
           <w:iCs/>
-          <w:i/>
         </w:rPr>
         <w:t xml:space="preserve">Why: identifies configuration owners, administrative permissions, and change-management requirements (3.1–3.4).</w:t>
       </w:r>
@@ -613,8 +571,8 @@
         </w:pict>
       </w:r>
     </w:p>
-    <w:bookmarkEnd w:id="26"/>
-    <w:bookmarkStart w:id="27" w:name="section-2-feature-scoping"/>
+    <w:bookmarkEnd w:id="15"/>
+    <w:bookmarkStart w:id="16" w:name="section-2-feature-scoping"/>
     <w:p>
       <w:pPr>
         <w:pStyle w:val="Heading2"/>
@@ -643,9 +601,8 @@
       <w:tblPr>
         <w:tblStyle w:val="Table"/>
         <w:tblW w:w="9360" w:type="dxa"/>
+        <w:tblLayout w:type="fixed"/>
         <w:tblLook w:firstRow="1" w:lastRow="0" w:firstColumn="0" w:lastColumn="0" w:noHBand="0" w:noVBand="0" w:val="0020"/>
-        <w:jc w:val="start"/>
-        <w:tblLayout w:type="fixed"/>
       </w:tblPr>
       <w:tblGrid>
         <w:gridCol w:w="6343"/>
@@ -655,7 +612,7 @@
       <w:tr>
         <w:trPr>
           <w:cantSplit/>
-          <w:tblHeader w:val="true"/>
+          <w:tblHeader w:val="on"/>
         </w:trPr>
         <w:tc>
           <w:tcPr/>
@@ -1360,8 +1317,8 @@
         </w:pict>
       </w:r>
     </w:p>
-    <w:bookmarkEnd w:id="27"/>
-    <w:bookmarkStart w:id="60" w:name="section-3-feature-deep-dives"/>
+    <w:bookmarkEnd w:id="16"/>
+    <w:bookmarkStart w:id="50" w:name="section-3-feature-deep-dives"/>
     <w:p>
       <w:pPr>
         <w:pStyle w:val="Heading2"/>
@@ -1382,9 +1339,8 @@
       <w:tblPr>
         <w:tblStyle w:val="Table"/>
         <w:tblW w:w="9360" w:type="dxa"/>
+        <w:tblLayout w:type="fixed"/>
         <w:tblLook w:firstRow="1" w:lastRow="0" w:firstColumn="0" w:lastColumn="0" w:noHBand="0" w:noVBand="0" w:val="0020"/>
-        <w:jc w:val="start"/>
-        <w:tblLayout w:type="fixed"/>
       </w:tblPr>
       <w:tblGrid>
         <w:gridCol w:w="3536"/>
@@ -1394,7 +1350,7 @@
       <w:tr>
         <w:trPr>
           <w:cantSplit/>
-          <w:tblHeader w:val="true"/>
+          <w:tblHeader w:val="on"/>
         </w:trPr>
         <w:tc>
           <w:tcPr/>
@@ -1598,7 +1554,7 @@
         </w:tc>
       </w:tr>
     </w:tbl>
-    <w:bookmarkStart w:id="35" w:name="foundations"/>
+    <w:bookmarkStart w:id="24" w:name="foundations"/>
     <w:p>
       <w:pPr>
         <w:pStyle w:val="Heading3"/>
@@ -1607,7 +1563,7 @@
         <w:t xml:space="preserve">Foundations</w:t>
       </w:r>
     </w:p>
-    <w:bookmarkStart w:id="29" w:name="visit-types-and-parameter-ownership"/>
+    <w:bookmarkStart w:id="18" w:name="visit-types-and-parameter-ownership"/>
     <w:p>
       <w:pPr>
         <w:pStyle w:val="Heading4"/>
@@ -1671,7 +1627,7 @@
       <w:r>
         <w:t xml:space="preserve"> </w:t>
       </w:r>
-      <w:hyperlink r:id="rId28">
+      <w:hyperlink r:id="rId17">
         <w:r>
           <w:rPr>
             <w:rStyle w:val="Hyperlink"/>
@@ -1689,43 +1645,43 @@
       </w:pPr>
       <w:r>
         <w:rPr>
+          <w:b/>
           <w:bCs/>
-          <w:b/>
         </w:rPr>
         <w:t xml:space="preserve">Questions:</w:t>
       </w:r>
     </w:p>
     <w:p>
       <w:pPr>
+        <w:pStyle w:val="Compact"/>
         <w:numPr>
           <w:ilvl w:val="0"/>
           <w:numId w:val="1005"/>
         </w:numPr>
+      </w:pPr>
+      <w:r>
+        <w:t xml:space="preserve">What distinguishes one visit type from another?</w:t>
+      </w:r>
+    </w:p>
+    <w:p>
+      <w:pPr>
         <w:pStyle w:val="Compact"/>
-      </w:pPr>
-      <w:r>
-        <w:t xml:space="preserve">What distinguishes one visit type from another?</w:t>
-      </w:r>
-    </w:p>
-    <w:p>
-      <w:pPr>
         <w:numPr>
           <w:ilvl w:val="0"/>
           <w:numId w:val="1005"/>
         </w:numPr>
+      </w:pPr>
+      <w:r>
+        <w:t xml:space="preserve">Which duration, start-time grid, buffers, and capacity settings are shared?</w:t>
+      </w:r>
+    </w:p>
+    <w:p>
+      <w:pPr>
         <w:pStyle w:val="Compact"/>
-      </w:pPr>
-      <w:r>
-        <w:t xml:space="preserve">Which duration, start-time grid, buffers, and capacity settings are shared?</w:t>
-      </w:r>
-    </w:p>
-    <w:p>
-      <w:pPr>
         <w:numPr>
           <w:ilvl w:val="0"/>
           <w:numId w:val="1005"/>
         </w:numPr>
-        <w:pStyle w:val="Compact"/>
       </w:pPr>
       <w:r>
         <w:t xml:space="preserve">Which actors or sites need different settings, and who can change them?</w:t>
@@ -1735,9 +1691,8 @@
       <w:tblPr>
         <w:tblStyle w:val="Table"/>
         <w:tblW w:w="9360" w:type="dxa"/>
+        <w:tblLayout w:type="fixed"/>
         <w:tblLook w:firstRow="1" w:lastRow="0" w:firstColumn="0" w:lastColumn="0" w:noHBand="0" w:noVBand="0" w:val="0020"/>
-        <w:jc w:val="start"/>
-        <w:tblLayout w:type="fixed"/>
       </w:tblPr>
       <w:tblGrid>
         <w:gridCol w:w="4213"/>
@@ -1746,7 +1701,7 @@
       <w:tr>
         <w:trPr>
           <w:cantSplit/>
-          <w:tblHeader w:val="true"/>
+          <w:tblHeader w:val="on"/>
         </w:trPr>
         <w:tc>
           <w:tcPr/>
@@ -1964,8 +1919,8 @@
       </w:pPr>
       <w:r>
         <w:rPr>
+          <w:b/>
           <w:bCs/>
-          <w:b/>
         </w:rPr>
         <w:t xml:space="preserve">Reference matching matters:</w:t>
       </w:r>
@@ -2000,8 +1955,8 @@
         <w:t xml:space="preserve">sub-extension. A matching code alone does not establish these links, and an override without a service pointer is ignored.</w:t>
       </w:r>
     </w:p>
-    <w:bookmarkEnd w:id="29"/>
-    <w:bookmarkStart w:id="30" w:name="actors-and-schedule-modeling"/>
+    <w:bookmarkEnd w:id="18"/>
+    <w:bookmarkStart w:id="19" w:name="actors-and-schedule-modeling"/>
     <w:p>
       <w:pPr>
         <w:pStyle w:val="Heading4"/>
@@ -2024,43 +1979,43 @@
       </w:pPr>
       <w:r>
         <w:rPr>
+          <w:b/>
           <w:bCs/>
-          <w:b/>
         </w:rPr>
         <w:t xml:space="preserve">Questions:</w:t>
       </w:r>
     </w:p>
     <w:p>
       <w:pPr>
+        <w:pStyle w:val="Compact"/>
         <w:numPr>
           <w:ilvl w:val="0"/>
           <w:numId w:val="1006"/>
         </w:numPr>
+      </w:pPr>
+      <w:r>
+        <w:t xml:space="preserve">Which practitioners, rooms, and devices must be reserved?</w:t>
+      </w:r>
+    </w:p>
+    <w:p>
+      <w:pPr>
         <w:pStyle w:val="Compact"/>
-      </w:pPr>
-      <w:r>
-        <w:t xml:space="preserve">Which practitioners, rooms, and devices must be reserved?</w:t>
-      </w:r>
-    </w:p>
-    <w:p>
-      <w:pPr>
         <w:numPr>
           <w:ilvl w:val="0"/>
           <w:numId w:val="1006"/>
         </w:numPr>
+      </w:pPr>
+      <w:r>
+        <w:t xml:space="preserve">Is a Location a bookable resource, a site of service, or a jurisdiction?</w:t>
+      </w:r>
+    </w:p>
+    <w:p>
+      <w:pPr>
         <w:pStyle w:val="Compact"/>
-      </w:pPr>
-      <w:r>
-        <w:t xml:space="preserve">Is a Location a bookable resource, a site of service, or a jurisdiction?</w:t>
-      </w:r>
-    </w:p>
-    <w:p>
-      <w:pPr>
         <w:numPr>
           <w:ilvl w:val="0"/>
           <w:numId w:val="1006"/>
         </w:numPr>
-        <w:pStyle w:val="Compact"/>
       </w:pPr>
       <w:r>
         <w:t xml:space="preserve">Are resource requirements simultaneous, or different phases of a procedure?</w:t>
@@ -2070,18 +2025,17 @@
       <w:tblPr>
         <w:tblStyle w:val="Table"/>
         <w:tblW w:w="9360" w:type="dxa"/>
+        <w:tblLayout w:type="fixed"/>
         <w:tblLook w:firstRow="1" w:lastRow="0" w:firstColumn="0" w:lastColumn="0" w:noHBand="0" w:noVBand="0" w:val="0020"/>
-        <w:jc w:val="start"/>
-        <w:tblLayout w:type="fixed"/>
       </w:tblPr>
       <w:tblGrid>
-        <w:gridCol w:w="4491"/>
-        <w:gridCol w:w="4869"/>
+        <w:gridCol w:w="3999"/>
+        <w:gridCol w:w="5361"/>
       </w:tblGrid>
       <w:tr>
         <w:trPr>
           <w:cantSplit/>
-          <w:tblHeader w:val="true"/>
+          <w:tblHeader w:val="on"/>
         </w:trPr>
         <w:tc>
           <w:tcPr/>
@@ -2207,6 +2161,89 @@
               <w:jc w:val="left"/>
             </w:pPr>
             <w:r>
+              <w:t xml:space="preserve">Record the appointment’s site</w:t>
+            </w:r>
+          </w:p>
+        </w:tc>
+        <w:tc>
+          <w:tcPr/>
+          <w:p>
+            <w:pPr>
+              <w:pStyle w:val="Compact"/>
+              <w:jc w:val="left"/>
+            </w:pPr>
+            <w:r>
+              <w:t xml:space="preserve">Store a Location reference in</w:t>
+            </w:r>
+            <w:r>
+              <w:t xml:space="preserve"> </w:t>
+            </w:r>
+            <w:r>
+              <w:rPr>
+                <w:rStyle w:val="VerbatimChar"/>
+              </w:rPr>
+              <w:t xml:space="preserve">Appointment.supportingInformation</w:t>
+            </w:r>
+            <w:r>
+              <w:t xml:space="preserve"> </w:t>
+            </w:r>
+            <w:r>
+              <w:t xml:space="preserve">using</w:t>
+            </w:r>
+            <w:r>
+              <w:t xml:space="preserve"> </w:t>
+            </w:r>
+            <w:r>
+              <w:rPr>
+                <w:rStyle w:val="VerbatimChar"/>
+              </w:rPr>
+              <w:t xml:space="preserve">toAppointmentSiteReference</w:t>
+            </w:r>
+            <w:r>
+              <w:t xml:space="preserve"> </w:t>
+            </w:r>
+            <w:r>
+              <w:t xml:space="preserve">from</w:t>
+            </w:r>
+            <w:r>
+              <w:t xml:space="preserve"> </w:t>
+            </w:r>
+            <w:r>
+              <w:rPr>
+                <w:rStyle w:val="VerbatimChar"/>
+              </w:rPr>
+              <w:t xml:space="preserve">@medplum/core</w:t>
+            </w:r>
+            <w:r>
+              <w:t xml:space="preserve">; read it with</w:t>
+            </w:r>
+            <w:r>
+              <w:t xml:space="preserve"> </w:t>
+            </w:r>
+            <w:r>
+              <w:rPr>
+                <w:rStyle w:val="VerbatimChar"/>
+              </w:rPr>
+              <w:t xml:space="preserve">getAppointmentSite</w:t>
+            </w:r>
+            <w:r>
+              <w:t xml:space="preserve">. This identifies the site separately from a booked room and does not reserve capacity.</w:t>
+            </w:r>
+          </w:p>
+        </w:tc>
+      </w:tr>
+      <w:tr>
+        <w:trPr>
+          <w:cantSplit/>
+        </w:trPr>
+        <w:tc>
+          <w:tcPr/>
+          <w:p>
+            <w:pPr>
+              <w:pStyle w:val="Compact"/>
+              <w:jc w:val="left"/>
+            </w:pPr>
+            <w:r>
               <w:t xml:space="preserve">Same person at several sites</w:t>
             </w:r>
           </w:p>
@@ -2254,8 +2291,8 @@
         </w:tc>
       </w:tr>
     </w:tbl>
-    <w:bookmarkEnd w:id="30"/>
-    <w:bookmarkStart w:id="31" w:name="availability-time-zones-and-blocks"/>
+    <w:bookmarkEnd w:id="19"/>
+    <w:bookmarkStart w:id="20" w:name="availability-time-zones-and-blocks"/>
     <w:p>
       <w:pPr>
         <w:pStyle w:val="Heading4"/>
@@ -2278,55 +2315,55 @@
       </w:pPr>
       <w:r>
         <w:rPr>
+          <w:b/>
           <w:bCs/>
-          <w:b/>
         </w:rPr>
         <w:t xml:space="preserve">Questions:</w:t>
       </w:r>
     </w:p>
     <w:p>
       <w:pPr>
+        <w:pStyle w:val="Compact"/>
         <w:numPr>
           <w:ilvl w:val="0"/>
           <w:numId w:val="1007"/>
         </w:numPr>
+      </w:pPr>
+      <w:r>
+        <w:t xml:space="preserve">Are weekly hours shared, actor-specific, or service-specific?</w:t>
+      </w:r>
+    </w:p>
+    <w:p>
+      <w:pPr>
         <w:pStyle w:val="Compact"/>
-      </w:pPr>
-      <w:r>
-        <w:t xml:space="preserve">Are weekly hours shared, actor-specific, or service-specific?</w:t>
-      </w:r>
-    </w:p>
-    <w:p>
-      <w:pPr>
         <w:numPr>
           <w:ilvl w:val="0"/>
           <w:numId w:val="1007"/>
         </w:numPr>
+      </w:pPr>
+      <w:r>
+        <w:t xml:space="preserve">Which time zone defines local hours and which defines the start-time grid?</w:t>
+      </w:r>
+    </w:p>
+    <w:p>
+      <w:pPr>
         <w:pStyle w:val="Compact"/>
-      </w:pPr>
-      <w:r>
-        <w:t xml:space="preserve">Which time zone defines local hours and which defines the start-time grid?</w:t>
-      </w:r>
-    </w:p>
-    <w:p>
-      <w:pPr>
         <w:numPr>
           <w:ilvl w:val="0"/>
           <w:numId w:val="1007"/>
         </w:numPr>
+      </w:pPr>
+      <w:r>
+        <w:t xml:space="preserve">What are the maximum booking horizon, minimum notice, and exception rules?</w:t>
+      </w:r>
+    </w:p>
+    <w:p>
+      <w:pPr>
         <w:pStyle w:val="Compact"/>
-      </w:pPr>
-      <w:r>
-        <w:t xml:space="preserve">What are the maximum booking horizon, minimum notice, and exception rules?</w:t>
-      </w:r>
-    </w:p>
-    <w:p>
-      <w:pPr>
         <w:numPr>
           <w:ilvl w:val="0"/>
           <w:numId w:val="1007"/>
         </w:numPr>
-        <w:pStyle w:val="Compact"/>
       </w:pPr>
       <w:r>
         <w:t xml:space="preserve">Who enters closures, and what happens to appointments already booked?</w:t>
@@ -2336,9 +2373,8 @@
       <w:tblPr>
         <w:tblStyle w:val="Table"/>
         <w:tblW w:w="9360" w:type="dxa"/>
+        <w:tblLayout w:type="fixed"/>
         <w:tblLook w:firstRow="1" w:lastRow="0" w:firstColumn="0" w:lastColumn="0" w:noHBand="0" w:noVBand="0" w:val="0020"/>
-        <w:jc w:val="start"/>
-        <w:tblLayout w:type="fixed"/>
       </w:tblPr>
       <w:tblGrid>
         <w:gridCol w:w="4342"/>
@@ -2347,7 +2383,7 @@
       <w:tr>
         <w:trPr>
           <w:cantSplit/>
-          <w:tblHeader w:val="true"/>
+          <w:tblHeader w:val="on"/>
         </w:trPr>
         <w:tc>
           <w:tcPr/>
@@ -2718,8 +2754,8 @@
       </w:pPr>
       <w:r>
         <w:rPr>
+          <w:b/>
           <w:bCs/>
-          <w:b/>
         </w:rPr>
         <w:t xml:space="preserve">Defaults need explicit review:</w:t>
       </w:r>
@@ -2745,8 +2781,8 @@
         <w:t xml:space="preserve">is not currently processed; use blocked Slots for exceptions. A new block does not itself resolve existing appointments, so define the notification and rescheduling workflow.</w:t>
       </w:r>
     </w:p>
-    <w:bookmarkEnd w:id="31"/>
-    <w:bookmarkStart w:id="34" w:name="access-and-delegated-administration"/>
+    <w:bookmarkEnd w:id="20"/>
+    <w:bookmarkStart w:id="23" w:name="access-and-delegated-administration"/>
     <w:p>
       <w:pPr>
         <w:pStyle w:val="Heading4"/>
@@ -2765,7 +2801,7 @@
       <w:r>
         <w:t xml:space="preserve"> </w:t>
       </w:r>
-      <w:hyperlink r:id="rId32">
+      <w:hyperlink r:id="rId21">
         <w:r>
           <w:rPr>
             <w:rStyle w:val="Hyperlink"/>
@@ -2782,7 +2818,7 @@
       <w:r>
         <w:t xml:space="preserve"> </w:t>
       </w:r>
-      <w:hyperlink r:id="rId33">
+      <w:hyperlink r:id="rId22">
         <w:r>
           <w:rPr>
             <w:rStyle w:val="Hyperlink"/>
@@ -2803,43 +2839,43 @@
       </w:pPr>
       <w:r>
         <w:rPr>
+          <w:b/>
           <w:bCs/>
-          <w:b/>
         </w:rPr>
         <w:t xml:space="preserve">Questions:</w:t>
       </w:r>
     </w:p>
     <w:p>
       <w:pPr>
+        <w:pStyle w:val="Compact"/>
         <w:numPr>
           <w:ilvl w:val="0"/>
           <w:numId w:val="1008"/>
         </w:numPr>
+      </w:pPr>
+      <w:r>
+        <w:t xml:space="preserve">Can patients discover availability without reading other patients’ appointments?</w:t>
+      </w:r>
+    </w:p>
+    <w:p>
+      <w:pPr>
         <w:pStyle w:val="Compact"/>
-      </w:pPr>
-      <w:r>
-        <w:t xml:space="preserve">Can patients discover availability without reading other patients’ appointments?</w:t>
-      </w:r>
-    </w:p>
-    <w:p>
-      <w:pPr>
         <w:numPr>
           <w:ilvl w:val="0"/>
           <w:numId w:val="1008"/>
         </w:numPr>
+      </w:pPr>
+      <w:r>
+        <w:t xml:space="preserve">Which staff can book or cancel for which patients and organizations?</w:t>
+      </w:r>
+    </w:p>
+    <w:p>
+      <w:pPr>
         <w:pStyle w:val="Compact"/>
-      </w:pPr>
-      <w:r>
-        <w:t xml:space="preserve">Which staff can book or cancel for which patients and organizations?</w:t>
-      </w:r>
-    </w:p>
-    <w:p>
-      <w:pPr>
         <w:numPr>
           <w:ilvl w:val="0"/>
           <w:numId w:val="1008"/>
         </w:numPr>
-        <w:pStyle w:val="Compact"/>
       </w:pPr>
       <w:r>
         <w:t xml:space="preserve">Who can change shared defaults, provider hours, or blocked time?</w:t>
@@ -2849,9 +2885,8 @@
       <w:tblPr>
         <w:tblStyle w:val="Table"/>
         <w:tblW w:w="9360" w:type="dxa"/>
+        <w:tblLayout w:type="fixed"/>
         <w:tblLook w:firstRow="1" w:lastRow="0" w:firstColumn="0" w:lastColumn="0" w:noHBand="0" w:noVBand="0" w:val="0020"/>
-        <w:jc w:val="start"/>
-        <w:tblLayout w:type="fixed"/>
       </w:tblPr>
       <w:tblGrid>
         <w:gridCol w:w="4638"/>
@@ -2860,7 +2895,7 @@
       <w:tr>
         <w:trPr>
           <w:cantSplit/>
-          <w:tblHeader w:val="true"/>
+          <w:tblHeader w:val="on"/>
         </w:trPr>
         <w:tc>
           <w:tcPr/>
@@ -2957,6 +2992,50 @@
               <w:jc w:val="left"/>
             </w:pPr>
             <w:r>
+              <w:t xml:space="preserve">Rescheduling permission</w:t>
+            </w:r>
+          </w:p>
+        </w:tc>
+        <w:tc>
+          <w:tcPr/>
+          <w:p>
+            <w:pPr>
+              <w:pStyle w:val="Compact"/>
+              <w:jc w:val="left"/>
+            </w:pPr>
+            <w:r>
+              <w:t xml:space="preserve">In addition to booking access,</w:t>
+            </w:r>
+            <w:r>
+              <w:t xml:space="preserve"> </w:t>
+            </w:r>
+            <w:r>
+              <w:rPr>
+                <w:rStyle w:val="VerbatimChar"/>
+              </w:rPr>
+              <w:t xml:space="preserve">$reschedule</w:t>
+            </w:r>
+            <w:r>
+              <w:t xml:space="preserve"> </w:t>
+            </w:r>
+            <w:r>
+              <w:t xml:space="preserve">needs Appointment read/update and Slot read/delete access. The existing Slots and their Schedules must be readable. Test these permissions explicitly; permission to book does not imply permission to move an appointment.</w:t>
+            </w:r>
+          </w:p>
+        </w:tc>
+      </w:tr>
+      <w:tr>
+        <w:trPr>
+          <w:cantSplit/>
+        </w:trPr>
+        <w:tc>
+          <w:tcPr/>
+          <w:p>
+            <w:pPr>
+              <w:pStyle w:val="Compact"/>
+              <w:jc w:val="left"/>
+            </w:pPr>
+            <w:r>
               <w:t xml:space="preserve">Required business checks beyond access rules</w:t>
             </w:r>
           </w:p>
@@ -3012,9 +3091,9 @@
         <w:t xml:space="preserve">Candidate filtering and hidden UI controls are not authorization. Do not assume permissions on a Schedule automatically confer the intended permissions on its Slots or Appointments. A post-write Subscription Bot can trigger follow-up work, but cannot serve as a pre-commit rejection of the original write.</w:t>
       </w:r>
     </w:p>
-    <w:bookmarkEnd w:id="34"/>
-    <w:bookmarkEnd w:id="35"/>
-    <w:bookmarkStart w:id="40" w:name="finding-an-appointment"/>
+    <w:bookmarkEnd w:id="23"/>
+    <w:bookmarkEnd w:id="24"/>
+    <w:bookmarkStart w:id="29" w:name="finding-an-appointment"/>
     <w:p>
       <w:pPr>
         <w:pStyle w:val="Heading3"/>
@@ -3023,7 +3102,7 @@
         <w:t xml:space="preserve">Finding an Appointment</w:t>
       </w:r>
     </w:p>
-    <w:bookmarkStart w:id="37" w:name="X79a8cc13dcd75c0431a377eb1611debcf8d835c"/>
+    <w:bookmarkStart w:id="26" w:name="X79a8cc13dcd75c0431a377eb1611debcf8d835c"/>
     <w:p>
       <w:pPr>
         <w:pStyle w:val="Heading4"/>
@@ -3042,7 +3121,7 @@
       <w:r>
         <w:t xml:space="preserve"> </w:t>
       </w:r>
-      <w:hyperlink r:id="rId36">
+      <w:hyperlink r:id="rId25">
         <w:r>
           <w:rPr>
             <w:rStyle w:val="Hyperlink"/>
@@ -3060,85 +3139,67 @@
       </w:pPr>
       <w:r>
         <w:rPr>
+          <w:b/>
           <w:bCs/>
-          <w:b/>
         </w:rPr>
         <w:t xml:space="preserve">Questions:</w:t>
       </w:r>
     </w:p>
     <w:p>
       <w:pPr>
+        <w:pStyle w:val="Compact"/>
         <w:numPr>
           <w:ilvl w:val="0"/>
           <w:numId w:val="1009"/>
         </w:numPr>
+      </w:pPr>
+      <w:r>
+        <w:t xml:space="preserve">Is the request for a specific practitioner, a class of practitioners, or any eligible practitioner?</w:t>
+      </w:r>
+    </w:p>
+    <w:p>
+      <w:pPr>
         <w:pStyle w:val="Compact"/>
-      </w:pPr>
-      <w:r>
-        <w:t xml:space="preserve">Is the request for a specific practitioner, a class of practitioners, or any eligible practitioner?</w:t>
-      </w:r>
-    </w:p>
-    <w:p>
-      <w:pPr>
         <w:numPr>
           <w:ilvl w:val="0"/>
           <w:numId w:val="1009"/>
         </w:numPr>
+      </w:pPr>
+      <w:r>
+        <w:t xml:space="preserve">Which requirements are hard constraints, and which preferences can be relaxed with patient agreement?</w:t>
+      </w:r>
+    </w:p>
+    <w:p>
+      <w:pPr>
         <w:pStyle w:val="Compact"/>
-      </w:pPr>
-      <w:r>
-        <w:t xml:space="preserve">Which requirements are hard constraints, and which preferences can be relaxed with patient agreement?</w:t>
-      </w:r>
-    </w:p>
-    <w:p>
-      <w:pPr>
         <w:numPr>
           <w:ilvl w:val="0"/>
           <w:numId w:val="1009"/>
         </w:numPr>
+      </w:pPr>
+      <w:r>
+        <w:t xml:space="preserve">Are language, practitioner gender, continuity, location, or day/time preferences relevant?</w:t>
+      </w:r>
+    </w:p>
+    <w:p>
+      <w:pPr>
         <w:pStyle w:val="Compact"/>
-      </w:pPr>
-      <w:r>
-        <w:t xml:space="preserve">Are language, practitioner gender, continuity, location, or day/time preferences relevant?</w:t>
-      </w:r>
-    </w:p>
-    <w:p>
-      <w:pPr>
         <w:numPr>
           <w:ilvl w:val="0"/>
           <w:numId w:val="1009"/>
         </w:numPr>
+      </w:pPr>
+      <w:r>
+        <w:t xml:space="preserve">Does “first available” mean earliest overall, earliest preferred, or earliest within a bounded search?</w:t>
+      </w:r>
+    </w:p>
+    <w:p>
+      <w:pPr>
         <w:pStyle w:val="Compact"/>
-      </w:pPr>
-      <w:r>
-        <w:t xml:space="preserve">Does</w:t>
-      </w:r>
-      <w:r>
-        <w:t xml:space="preserve"> </w:t>
-      </w:r>
-      <w:r>
-        <w:t xml:space="preserve">“</w:t>
-      </w:r>
-      <w:r>
-        <w:t xml:space="preserve">first available</w:t>
-      </w:r>
-      <w:r>
-        <w:t xml:space="preserve">”</w:t>
-      </w:r>
-      <w:r>
-        <w:t xml:space="preserve"> </w:t>
-      </w:r>
-      <w:r>
-        <w:t xml:space="preserve">mean earliest overall, earliest preferred, or earliest within a bounded search?</w:t>
-      </w:r>
-    </w:p>
-    <w:p>
-      <w:pPr>
         <w:numPr>
           <w:ilvl w:val="0"/>
           <w:numId w:val="1009"/>
         </w:numPr>
-        <w:pStyle w:val="Compact"/>
       </w:pPr>
       <w:r>
         <w:t xml:space="preserve">How are equally suitable options selected, and what happens when some searches fail?</w:t>
@@ -3148,9 +3209,8 @@
       <w:tblPr>
         <w:tblStyle w:val="Table"/>
         <w:tblW w:w="9360" w:type="dxa"/>
+        <w:tblLayout w:type="fixed"/>
         <w:tblLook w:firstRow="1" w:lastRow="0" w:firstColumn="0" w:lastColumn="0" w:noHBand="0" w:noVBand="0" w:val="0020"/>
-        <w:jc w:val="start"/>
-        <w:tblLayout w:type="fixed"/>
       </w:tblPr>
       <w:tblGrid>
         <w:gridCol w:w="4265"/>
@@ -3159,7 +3219,7 @@
       <w:tr>
         <w:trPr>
           <w:cantSplit/>
-          <w:tblHeader w:val="true"/>
+          <w:tblHeader w:val="on"/>
         </w:trPr>
         <w:tc>
           <w:tcPr/>
@@ -3367,25 +3427,7 @@
               <w:jc w:val="left"/>
             </w:pPr>
             <w:r>
-              <w:t xml:space="preserve">Distinguish</w:t>
-            </w:r>
-            <w:r>
-              <w:t xml:space="preserve"> </w:t>
-            </w:r>
-            <w:r>
-              <w:t xml:space="preserve">“</w:t>
-            </w:r>
-            <w:r>
-              <w:t xml:space="preserve">no availability</w:t>
-            </w:r>
-            <w:r>
-              <w:t xml:space="preserve">”</w:t>
-            </w:r>
-            <w:r>
-              <w:t xml:space="preserve"> </w:t>
-            </w:r>
-            <w:r>
-              <w:t xml:space="preserve">from an incomplete or failed search. Do not claim globally earliest availability when only part of the candidate set was searched.</w:t>
+              <w:t xml:space="preserve">Distinguish “no availability” from an incomplete or failed search. Do not claim globally earliest availability when only part of the candidate set was searched.</w:t>
             </w:r>
           </w:p>
         </w:tc>
@@ -3408,8 +3450,8 @@
         <w:t xml:space="preserve">accepts explicit Schedules, not a patient-preference or ranking specification. Its search window is limited to 31 days per request; larger horizons require multiple requests. Result limits and candidate-combination limits must also be considered when defining first-available behavior.</w:t>
       </w:r>
     </w:p>
-    <w:bookmarkEnd w:id="37"/>
-    <w:bookmarkStart w:id="39" w:name="multi-resource-combinations"/>
+    <w:bookmarkEnd w:id="26"/>
+    <w:bookmarkStart w:id="28" w:name="multi-resource-combinations"/>
     <w:p>
       <w:pPr>
         <w:pStyle w:val="Heading4"/>
@@ -3443,7 +3485,7 @@
       <w:r>
         <w:t xml:space="preserve"> </w:t>
       </w:r>
-      <w:hyperlink r:id="rId38">
+      <w:hyperlink r:id="rId27">
         <w:r>
           <w:rPr>
             <w:rStyle w:val="VerbatimChar"/>
@@ -3464,43 +3506,43 @@
       </w:pPr>
       <w:r>
         <w:rPr>
+          <w:b/>
           <w:bCs/>
-          <w:b/>
         </w:rPr>
         <w:t xml:space="preserve">Questions:</w:t>
       </w:r>
     </w:p>
     <w:p>
       <w:pPr>
+        <w:pStyle w:val="Compact"/>
         <w:numPr>
           <w:ilvl w:val="0"/>
           <w:numId w:val="1010"/>
         </w:numPr>
+      </w:pPr>
+      <w:r>
+        <w:t xml:space="preserve">Does the appointment need one practitioner or several?</w:t>
+      </w:r>
+    </w:p>
+    <w:p>
+      <w:pPr>
         <w:pStyle w:val="Compact"/>
-      </w:pPr>
-      <w:r>
-        <w:t xml:space="preserve">Does the appointment need one practitioner or several?</w:t>
-      </w:r>
-    </w:p>
-    <w:p>
-      <w:pPr>
         <w:numPr>
           <w:ilvl w:val="0"/>
           <w:numId w:val="1010"/>
         </w:numPr>
+      </w:pPr>
+      <w:r>
+        <w:t xml:space="preserve">Are the room and device fixed, or can any eligible one be used?</w:t>
+      </w:r>
+    </w:p>
+    <w:p>
+      <w:pPr>
         <w:pStyle w:val="Compact"/>
-      </w:pPr>
-      <w:r>
-        <w:t xml:space="preserve">Are the room and device fixed, or can any eligible one be used?</w:t>
-      </w:r>
-    </w:p>
-    <w:p>
-      <w:pPr>
         <w:numPr>
           <w:ilvl w:val="0"/>
           <w:numId w:val="1010"/>
         </w:numPr>
-        <w:pStyle w:val="Compact"/>
       </w:pPr>
       <w:r>
         <w:t xml:space="preserve">How large can the candidate pool become?</w:t>
@@ -3510,9 +3552,8 @@
       <w:tblPr>
         <w:tblStyle w:val="Table"/>
         <w:tblW w:w="9360" w:type="dxa"/>
+        <w:tblLayout w:type="fixed"/>
         <w:tblLook w:firstRow="1" w:lastRow="0" w:firstColumn="0" w:lastColumn="0" w:noHBand="0" w:noVBand="0" w:val="0020"/>
-        <w:jc w:val="start"/>
-        <w:tblLayout w:type="fixed"/>
       </w:tblPr>
       <w:tblGrid>
         <w:gridCol w:w="4559"/>
@@ -3521,7 +3562,7 @@
       <w:tr>
         <w:trPr>
           <w:cantSplit/>
-          <w:tblHeader w:val="true"/>
+          <w:tblHeader w:val="on"/>
         </w:trPr>
         <w:tc>
           <w:tcPr/>
@@ -3718,9 +3759,9 @@
         <w:t xml:space="preserve">Use the server’s multi-Schedule booking operation for the selected combination. Sequential independent bookings can leave only part of the required appointment reserved.</w:t>
       </w:r>
     </w:p>
-    <w:bookmarkEnd w:id="39"/>
-    <w:bookmarkEnd w:id="40"/>
-    <w:bookmarkStart w:id="51" w:name="booking-and-managing-appointments"/>
+    <w:bookmarkEnd w:id="28"/>
+    <w:bookmarkEnd w:id="29"/>
+    <w:bookmarkStart w:id="41" w:name="booking-and-managing-appointments"/>
     <w:p>
       <w:pPr>
         <w:pStyle w:val="Heading3"/>
@@ -3729,7 +3770,7 @@
         <w:t xml:space="preserve">Booking and Managing Appointments</w:t>
       </w:r>
     </w:p>
-    <w:bookmarkStart w:id="42" w:name="capacity-and-group-visits"/>
+    <w:bookmarkStart w:id="31" w:name="capacity-and-group-visits"/>
     <w:p>
       <w:pPr>
         <w:pStyle w:val="Heading4"/>
@@ -3748,7 +3789,7 @@
       <w:r>
         <w:t xml:space="preserve"> </w:t>
       </w:r>
-      <w:hyperlink r:id="rId41">
+      <w:hyperlink r:id="rId30">
         <w:r>
           <w:rPr>
             <w:rStyle w:val="Hyperlink"/>
@@ -3766,43 +3807,43 @@
       </w:pPr>
       <w:r>
         <w:rPr>
+          <w:b/>
           <w:bCs/>
-          <w:b/>
         </w:rPr>
         <w:t xml:space="preserve">Questions:</w:t>
       </w:r>
     </w:p>
     <w:p>
       <w:pPr>
+        <w:pStyle w:val="Compact"/>
         <w:numPr>
           <w:ilvl w:val="0"/>
           <w:numId w:val="1011"/>
         </w:numPr>
+      </w:pPr>
+      <w:r>
+        <w:t xml:space="preserve">Must each chair or room be individually assigned, or are they interchangeable?</w:t>
+      </w:r>
+    </w:p>
+    <w:p>
+      <w:pPr>
         <w:pStyle w:val="Compact"/>
-      </w:pPr>
-      <w:r>
-        <w:t xml:space="preserve">Must each chair or room be individually assigned, or are they interchangeable?</w:t>
-      </w:r>
-    </w:p>
-    <w:p>
-      <w:pPr>
         <w:numPr>
           <w:ilvl w:val="0"/>
           <w:numId w:val="1011"/>
         </w:numPr>
+      </w:pPr>
+      <w:r>
+        <w:t xml:space="preserve">Does each patient need independent cancellation, access, clinical documentation, and billing?</w:t>
+      </w:r>
+    </w:p>
+    <w:p>
+      <w:pPr>
         <w:pStyle w:val="Compact"/>
-      </w:pPr>
-      <w:r>
-        <w:t xml:space="preserve">Does each patient need independent cancellation, access, clinical documentation, and billing?</w:t>
-      </w:r>
-    </w:p>
-    <w:p>
-      <w:pPr>
         <w:numPr>
           <w:ilvl w:val="0"/>
           <w:numId w:val="1011"/>
         </w:numPr>
-        <w:pStyle w:val="Compact"/>
       </w:pPr>
       <w:r>
         <w:t xml:space="preserve">Does a provider participate in every concurrent booking?</w:t>
@@ -3812,9 +3853,8 @@
       <w:tblPr>
         <w:tblStyle w:val="Table"/>
         <w:tblW w:w="9360" w:type="dxa"/>
+        <w:tblLayout w:type="fixed"/>
         <w:tblLook w:firstRow="1" w:lastRow="0" w:firstColumn="0" w:lastColumn="0" w:noHBand="0" w:noVBand="0" w:val="0020"/>
-        <w:jc w:val="start"/>
-        <w:tblLayout w:type="fixed"/>
       </w:tblPr>
       <w:tblGrid>
         <w:gridCol w:w="4446"/>
@@ -3823,7 +3863,7 @@
       <w:tr>
         <w:trPr>
           <w:cantSplit/>
-          <w:tblHeader w:val="true"/>
+          <w:tblHeader w:val="on"/>
         </w:trPr>
         <w:tc>
           <w:tcPr/>
@@ -4032,8 +4072,8 @@
       </w:pPr>
       <w:r>
         <w:rPr>
+          <w:b/>
           <w:bCs/>
-          <w:b/>
         </w:rPr>
         <w:t xml:space="preserve">Costly modeling choice:</w:t>
       </w:r>
@@ -4056,8 +4096,8 @@
         <w:t xml:space="preserve">; define any session grouping deliberately rather than inventing that field.</w:t>
       </w:r>
     </w:p>
-    <w:bookmarkEnd w:id="42"/>
-    <w:bookmarkStart w:id="47" w:name="immediate-booking-holds-and-approval"/>
+    <w:bookmarkEnd w:id="31"/>
+    <w:bookmarkStart w:id="36" w:name="immediate-booking-holds-and-approval"/>
     <w:p>
       <w:pPr>
         <w:pStyle w:val="Heading4"/>
@@ -4080,43 +4120,43 @@
       </w:pPr>
       <w:r>
         <w:rPr>
+          <w:b/>
           <w:bCs/>
-          <w:b/>
         </w:rPr>
         <w:t xml:space="preserve">Questions:</w:t>
       </w:r>
     </w:p>
     <w:p>
       <w:pPr>
+        <w:pStyle w:val="Compact"/>
         <w:numPr>
           <w:ilvl w:val="0"/>
           <w:numId w:val="1012"/>
         </w:numPr>
+      </w:pPr>
+      <w:r>
+        <w:t xml:space="preserve">Does the time need protection while details or approvals are collected?</w:t>
+      </w:r>
+    </w:p>
+    <w:p>
+      <w:pPr>
         <w:pStyle w:val="Compact"/>
-      </w:pPr>
-      <w:r>
-        <w:t xml:space="preserve">Does the time need protection while details or approvals are collected?</w:t>
-      </w:r>
-    </w:p>
-    <w:p>
-      <w:pPr>
         <w:numPr>
           <w:ilvl w:val="0"/>
           <w:numId w:val="1012"/>
         </w:numPr>
+      </w:pPr>
+      <w:r>
+        <w:t xml:space="preserve">Who approves, what evidence is required, and how long may a hold remain?</w:t>
+      </w:r>
+    </w:p>
+    <w:p>
+      <w:pPr>
         <w:pStyle w:val="Compact"/>
-      </w:pPr>
-      <w:r>
-        <w:t xml:space="preserve">Who approves, what evidence is required, and how long may a hold remain?</w:t>
-      </w:r>
-    </w:p>
-    <w:p>
-      <w:pPr>
         <w:numPr>
           <w:ilvl w:val="0"/>
           <w:numId w:val="1012"/>
         </w:numPr>
-        <w:pStyle w:val="Compact"/>
       </w:pPr>
       <w:r>
         <w:t xml:space="preserve">Who releases abandoned or rejected requests?</w:t>
@@ -4126,9 +4166,8 @@
       <w:tblPr>
         <w:tblStyle w:val="Table"/>
         <w:tblW w:w="9360" w:type="dxa"/>
+        <w:tblLayout w:type="fixed"/>
         <w:tblLook w:firstRow="1" w:lastRow="0" w:firstColumn="0" w:lastColumn="0" w:noHBand="0" w:noVBand="0" w:val="0020"/>
-        <w:jc w:val="start"/>
-        <w:tblLayout w:type="fixed"/>
       </w:tblPr>
       <w:tblGrid>
         <w:gridCol w:w="4128"/>
@@ -4137,7 +4176,7 @@
       <w:tr>
         <w:trPr>
           <w:cantSplit/>
-          <w:tblHeader w:val="true"/>
+          <w:tblHeader w:val="on"/>
         </w:trPr>
         <w:tc>
           <w:tcPr/>
@@ -4202,7 +4241,7 @@
             <w:r>
               <w:t xml:space="preserve"> </w:t>
             </w:r>
-            <w:hyperlink r:id="rId43">
+            <w:hyperlink r:id="rId32">
               <w:r>
                 <w:rPr>
                   <w:rStyle w:val="VerbatimChar"/>
@@ -4254,7 +4293,7 @@
             <w:r>
               <w:t xml:space="preserve"> </w:t>
             </w:r>
-            <w:hyperlink r:id="rId44">
+            <w:hyperlink r:id="rId33">
               <w:r>
                 <w:rPr>
                   <w:rStyle w:val="VerbatimChar"/>
@@ -4271,7 +4310,7 @@
             <w:r>
               <w:t xml:space="preserve"> </w:t>
             </w:r>
-            <w:hyperlink r:id="rId45">
+            <w:hyperlink r:id="rId34">
               <w:r>
                 <w:rPr>
                   <w:rStyle w:val="VerbatimChar"/>
@@ -4314,7 +4353,7 @@
             <w:r>
               <w:t xml:space="preserve"> </w:t>
             </w:r>
-            <w:hyperlink r:id="rId46">
+            <w:hyperlink r:id="rId35">
               <w:r>
                 <w:rPr>
                   <w:rStyle w:val="VerbatimChar"/>
@@ -4458,8 +4497,8 @@
         <w:t xml:space="preserve">as an Appointment status; it is a participant status. Make confirmation and expiry processing coordinate so an approval cannot race an independent cleanup workflow unnoticed.</w:t>
       </w:r>
     </w:p>
-    <w:bookmarkEnd w:id="47"/>
-    <w:bookmarkStart w:id="49" w:name="Xdef137807eee2820915ca6e2698c878ac10602d"/>
+    <w:bookmarkEnd w:id="36"/>
+    <w:bookmarkStart w:id="38" w:name="Xdef137807eee2820915ca6e2698c878ac10602d"/>
     <w:p>
       <w:pPr>
         <w:pStyle w:val="Heading4"/>
@@ -4500,10 +4539,7 @@
         <w:t xml:space="preserve">$book</w:t>
       </w:r>
       <w:r>
-        <w:t xml:space="preserve"> </w:t>
-      </w:r>
-      <w:r>
-        <w:t xml:space="preserve">and</w:t>
+        <w:t xml:space="preserve">,</w:t>
       </w:r>
       <w:r>
         <w:t xml:space="preserve"> </w:t>
@@ -4515,9 +4551,21 @@
         <w:t xml:space="preserve">$hold</w:t>
       </w:r>
       <w:r>
+        <w:t xml:space="preserve">, and</w:t>
+      </w:r>
+      <w:r>
         <w:t xml:space="preserve"> </w:t>
       </w:r>
       <w:r>
+        <w:rPr>
+          <w:rStyle w:val="VerbatimChar"/>
+        </w:rPr>
+        <w:t xml:space="preserve">$reschedule</w:t>
+      </w:r>
+      <w:r>
+        <w:t xml:space="preserve"> </w:t>
+      </w:r>
+      <w:r>
         <w:t xml:space="preserve">recheck availability transactionally, including capacity and buffers.</w:t>
       </w:r>
     </w:p>
@@ -4527,43 +4575,43 @@
       </w:pPr>
       <w:r>
         <w:rPr>
+          <w:b/>
           <w:bCs/>
-          <w:b/>
         </w:rPr>
         <w:t xml:space="preserve">Questions:</w:t>
       </w:r>
     </w:p>
     <w:p>
       <w:pPr>
+        <w:pStyle w:val="Compact"/>
         <w:numPr>
           <w:ilvl w:val="0"/>
           <w:numId w:val="1013"/>
         </w:numPr>
+      </w:pPr>
+      <w:r>
+        <w:t xml:space="preserve">Is refresh-on-action sufficient, or does the workflow need live updates?</w:t>
+      </w:r>
+    </w:p>
+    <w:p>
+      <w:pPr>
         <w:pStyle w:val="Compact"/>
-      </w:pPr>
-      <w:r>
-        <w:t xml:space="preserve">Is refresh-on-action sufficient, or does the workflow need live updates?</w:t>
-      </w:r>
-    </w:p>
-    <w:p>
-      <w:pPr>
         <w:numPr>
           <w:ilvl w:val="0"/>
           <w:numId w:val="1013"/>
         </w:numPr>
+      </w:pPr>
+      <w:r>
+        <w:t xml:space="preserve">What happens when another user books the last available capacity?</w:t>
+      </w:r>
+    </w:p>
+    <w:p>
+      <w:pPr>
         <w:pStyle w:val="Compact"/>
-      </w:pPr>
-      <w:r>
-        <w:t xml:space="preserve">What happens when another user books the last available capacity?</w:t>
-      </w:r>
-    </w:p>
-    <w:p>
-      <w:pPr>
         <w:numPr>
           <w:ilvl w:val="0"/>
           <w:numId w:val="1013"/>
         </w:numPr>
-        <w:pStyle w:val="Compact"/>
       </w:pPr>
       <w:r>
         <w:t xml:space="preserve">Which exceptions are allowed, who authorizes them, and how are they audited?</w:t>
@@ -4573,9 +4621,8 @@
       <w:tblPr>
         <w:tblStyle w:val="Table"/>
         <w:tblW w:w="9360" w:type="dxa"/>
+        <w:tblLayout w:type="fixed"/>
         <w:tblLook w:firstRow="1" w:lastRow="0" w:firstColumn="0" w:lastColumn="0" w:noHBand="0" w:noVBand="0" w:val="0020"/>
-        <w:jc w:val="start"/>
-        <w:tblLayout w:type="fixed"/>
       </w:tblPr>
       <w:tblGrid>
         <w:gridCol w:w="4621"/>
@@ -4584,7 +4631,7 @@
       <w:tr>
         <w:trPr>
           <w:cantSplit/>
-          <w:tblHeader w:val="true"/>
+          <w:tblHeader w:val="on"/>
         </w:trPr>
         <w:tc>
           <w:tcPr/>
@@ -4669,7 +4716,7 @@
             <w:r>
               <w:t xml:space="preserve"> </w:t>
             </w:r>
-            <w:hyperlink r:id="rId48">
+            <w:hyperlink r:id="rId37">
               <w:r>
                 <w:rPr>
                   <w:rStyle w:val="Hyperlink"/>
@@ -4806,8 +4853,8 @@
         <w:t xml:space="preserve">’s conflict checks. Ensure transaction support is enabled for cross-referencing writes; do not rely on a batch fallback for atomicity.</w:t>
       </w:r>
     </w:p>
-    <w:bookmarkEnd w:id="49"/>
-    <w:bookmarkStart w:id="50" w:name="X37a303b7b9065bee9f98c1e2146ddd765cd8ac4"/>
+    <w:bookmarkEnd w:id="38"/>
+    <w:bookmarkStart w:id="40" w:name="X37a303b7b9065bee9f98c1e2146ddd765cd8ac4"/>
     <w:p>
       <w:pPr>
         <w:pStyle w:val="Heading4"/>
@@ -4830,55 +4877,55 @@
       </w:pPr>
       <w:r>
         <w:rPr>
+          <w:b/>
           <w:bCs/>
-          <w:b/>
         </w:rPr>
         <w:t xml:space="preserve">Questions:</w:t>
       </w:r>
     </w:p>
     <w:p>
       <w:pPr>
+        <w:pStyle w:val="Compact"/>
         <w:numPr>
           <w:ilvl w:val="0"/>
           <w:numId w:val="1014"/>
         </w:numPr>
+      </w:pPr>
+      <w:r>
+        <w:t xml:space="preserve">Who can cancel or move an appointment, and with what notice?</w:t>
+      </w:r>
+    </w:p>
+    <w:p>
+      <w:pPr>
         <w:pStyle w:val="Compact"/>
-      </w:pPr>
-      <w:r>
-        <w:t xml:space="preserve">Who can cancel or move an appointment, and with what notice?</w:t>
-      </w:r>
-    </w:p>
-    <w:p>
-      <w:pPr>
         <w:numPr>
           <w:ilvl w:val="0"/>
           <w:numId w:val="1014"/>
         </w:numPr>
+      </w:pPr>
+      <w:r>
+        <w:t xml:space="preserve">Must rescheduling preserve Appointment identity and downstream references?</w:t>
+      </w:r>
+    </w:p>
+    <w:p>
+      <w:pPr>
         <w:pStyle w:val="Compact"/>
-      </w:pPr>
-      <w:r>
-        <w:t xml:space="preserve">Must rescheduling preserve Appointment identity and downstream references?</w:t>
-      </w:r>
-    </w:p>
-    <w:p>
-      <w:pPr>
         <w:numPr>
           <w:ilvl w:val="0"/>
           <w:numId w:val="1014"/>
         </w:numPr>
+      </w:pPr>
+      <w:r>
+        <w:t xml:space="preserve">Which arrival, no-show, and completion states are needed?</w:t>
+      </w:r>
+    </w:p>
+    <w:p>
+      <w:pPr>
         <w:pStyle w:val="Compact"/>
-      </w:pPr>
-      <w:r>
-        <w:t xml:space="preserve">Which arrival, no-show, and completion states are needed?</w:t>
-      </w:r>
-    </w:p>
-    <w:p>
-      <w:pPr>
         <w:numPr>
           <w:ilvl w:val="0"/>
           <w:numId w:val="1014"/>
         </w:numPr>
-        <w:pStyle w:val="Compact"/>
       </w:pPr>
       <w:r>
         <w:t xml:space="preserve">When is the Encounter created, and who owns that automation?</w:t>
@@ -4888,18 +4935,17 @@
       <w:tblPr>
         <w:tblStyle w:val="Table"/>
         <w:tblW w:w="9360" w:type="dxa"/>
+        <w:tblLayout w:type="fixed"/>
         <w:tblLook w:firstRow="1" w:lastRow="0" w:firstColumn="0" w:lastColumn="0" w:noHBand="0" w:noVBand="0" w:val="0020"/>
-        <w:jc w:val="start"/>
-        <w:tblLayout w:type="fixed"/>
       </w:tblPr>
       <w:tblGrid>
-        <w:gridCol w:w="4150"/>
-        <w:gridCol w:w="5210"/>
+        <w:gridCol w:w="3882"/>
+        <w:gridCol w:w="5478"/>
       </w:tblGrid>
       <w:tr>
         <w:trPr>
           <w:cantSplit/>
-          <w:tblHeader w:val="true"/>
+          <w:tblHeader w:val="on"/>
         </w:trPr>
         <w:tc>
           <w:tcPr/>
@@ -4991,6 +5037,107 @@
               <w:jc w:val="left"/>
             </w:pPr>
             <w:r>
+              <w:t xml:space="preserve">Find a replacement time or resource</w:t>
+            </w:r>
+          </w:p>
+        </w:tc>
+        <w:tc>
+          <w:tcPr/>
+          <w:p>
+            <w:pPr>
+              <w:pStyle w:val="Compact"/>
+              <w:jc w:val="left"/>
+            </w:pPr>
+            <w:r>
+              <w:t xml:space="preserve">Pass</w:t>
+            </w:r>
+            <w:r>
+              <w:t xml:space="preserve"> </w:t>
+            </w:r>
+            <w:r>
+              <w:rPr>
+                <w:rStyle w:val="VerbatimChar"/>
+              </w:rPr>
+              <w:t xml:space="preserve">ignore-appointment=Appointment/{id}</w:t>
+            </w:r>
+            <w:r>
+              <w:t xml:space="preserve"> </w:t>
+            </w:r>
+            <w:r>
+              <w:t xml:space="preserve">to</w:t>
+            </w:r>
+            <w:r>
+              <w:t xml:space="preserve"> </w:t>
+            </w:r>
+            <w:r>
+              <w:rPr>
+                <w:rStyle w:val="VerbatimChar"/>
+              </w:rPr>
+              <w:t xml:space="preserve">$find</w:t>
+            </w:r>
+            <w:r>
+              <w:t xml:space="preserve"> </w:t>
+            </w:r>
+            <w:r>
+              <w:t xml:space="preserve">to exclude this appointment’s Slots, including buffers, from availability calculations. Other appointments still block. Commit the move with</w:t>
+            </w:r>
+            <w:r>
+              <w:t xml:space="preserve"> </w:t>
+            </w:r>
+            <w:r>
+              <w:rPr>
+                <w:rStyle w:val="VerbatimChar"/>
+              </w:rPr>
+              <w:t xml:space="preserve">$reschedule</w:t>
+            </w:r>
+            <w:r>
+              <w:t xml:space="preserve">;</w:t>
+            </w:r>
+            <w:r>
+              <w:t xml:space="preserve"> </w:t>
+            </w:r>
+            <w:r>
+              <w:rPr>
+                <w:rStyle w:val="VerbatimChar"/>
+              </w:rPr>
+              <w:t xml:space="preserve">$book</w:t>
+            </w:r>
+            <w:r>
+              <w:t xml:space="preserve"> </w:t>
+            </w:r>
+            <w:r>
+              <w:t xml:space="preserve">and</w:t>
+            </w:r>
+            <w:r>
+              <w:t xml:space="preserve"> </w:t>
+            </w:r>
+            <w:r>
+              <w:rPr>
+                <w:rStyle w:val="VerbatimChar"/>
+              </w:rPr>
+              <w:t xml:space="preserve">$hold</w:t>
+            </w:r>
+            <w:r>
+              <w:t xml:space="preserve"> </w:t>
+            </w:r>
+            <w:r>
+              <w:t xml:space="preserve">do not ignore the original Slots.</w:t>
+            </w:r>
+          </w:p>
+        </w:tc>
+      </w:tr>
+      <w:tr>
+        <w:trPr>
+          <w:cantSplit/>
+        </w:trPr>
+        <w:tc>
+          <w:tcPr/>
+          <w:p>
+            <w:pPr>
+              <w:pStyle w:val="Compact"/>
+              <w:jc w:val="left"/>
+            </w:pPr>
+            <w:r>
               <w:t xml:space="preserve">Move time or resources</w:t>
             </w:r>
           </w:p>
@@ -5003,7 +5150,77 @@
               <w:jc w:val="left"/>
             </w:pPr>
             <w:r>
-              <w:t xml:space="preserve">Check the operations available in your server version. Without an in-place reschedule operation, cancel-and-book needs explicit failure/recovery handling and creates a new Appointment identity. It is not an atomic move.</w:t>
+              <w:t xml:space="preserve">Use</w:t>
+            </w:r>
+            <w:r>
+              <w:t xml:space="preserve"> </w:t>
+            </w:r>
+            <w:hyperlink r:id="rId39">
+              <w:r>
+                <w:rPr>
+                  <w:rStyle w:val="VerbatimChar"/>
+                </w:rPr>
+                <w:t xml:space="preserve">$reschedule</w:t>
+              </w:r>
+            </w:hyperlink>
+            <w:r>
+              <w:t xml:space="preserve"> </w:t>
+            </w:r>
+            <w:r>
+              <w:t xml:space="preserve">for a booked or pending Appointment. Supply the new</w:t>
+            </w:r>
+            <w:r>
+              <w:t xml:space="preserve"> </w:t>
+            </w:r>
+            <w:r>
+              <w:rPr>
+                <w:rStyle w:val="VerbatimChar"/>
+              </w:rPr>
+              <w:t xml:space="preserve">start</w:t>
+            </w:r>
+            <w:r>
+              <w:t xml:space="preserve"> </w:t>
+            </w:r>
+            <w:r>
+              <w:t xml:space="preserve">and the complete set of destination Schedules. It preserves Appointment identity and status, reconciles scheduled participants, and replaces Slots atomically. If the new time is unavailable, the original booking remains intact.</w:t>
+            </w:r>
+          </w:p>
+        </w:tc>
+      </w:tr>
+      <w:tr>
+        <w:trPr>
+          <w:cantSplit/>
+        </w:trPr>
+        <w:tc>
+          <w:tcPr/>
+          <w:p>
+            <w:pPr>
+              <w:pStyle w:val="Compact"/>
+              <w:jc w:val="left"/>
+            </w:pPr>
+            <w:r>
+              <w:t xml:space="preserve">Change visit type</w:t>
+            </w:r>
+          </w:p>
+        </w:tc>
+        <w:tc>
+          <w:tcPr/>
+          <w:p>
+            <w:pPr>
+              <w:pStyle w:val="Compact"/>
+              <w:jc w:val="left"/>
+            </w:pPr>
+            <w:r>
+              <w:rPr>
+                <w:rStyle w:val="VerbatimChar"/>
+              </w:rPr>
+              <w:t xml:space="preserve">$reschedule</w:t>
+            </w:r>
+            <w:r>
+              <w:t xml:space="preserve"> </w:t>
+            </w:r>
+            <w:r>
+              <w:t xml:space="preserve">retains the original service type and requires exactly one HealthcareService reference on the stored Appointment. Changing visit type requires cancel-and-book, with explicit failure/recovery handling and a new Appointment identity.</w:t>
             </w:r>
           </w:p>
         </w:tc>
@@ -5187,6 +5404,44 @@
         <w:pStyle w:val="BodyText"/>
       </w:pPr>
       <w:r>
+        <w:t xml:space="preserve">Confirm that your server version supports</w:t>
+      </w:r>
+      <w:r>
+        <w:t xml:space="preserve"> </w:t>
+      </w:r>
+      <w:r>
+        <w:rPr>
+          <w:rStyle w:val="VerbatimChar"/>
+        </w:rPr>
+        <w:t xml:space="preserve">$reschedule</w:t>
+      </w:r>
+      <w:r>
+        <w:t xml:space="preserve"> </w:t>
+      </w:r>
+      <w:r>
+        <w:t xml:space="preserve">before choosing this workflow. It derives duration and buffers from the scheduling configuration; omitted Schedules are removed from the appointment. Patients and other non-scheduled participants are preserved. Slot IDs change, so integrations must handle Slot deletion and creation. Site metadata in</w:t>
+      </w:r>
+      <w:r>
+        <w:t xml:space="preserve"> </w:t>
+      </w:r>
+      <w:r>
+        <w:rPr>
+          <w:rStyle w:val="VerbatimChar"/>
+        </w:rPr>
+        <w:t xml:space="preserve">supportingInformation</w:t>
+      </w:r>
+      <w:r>
+        <w:t xml:space="preserve"> </w:t>
+      </w:r>
+      <w:r>
+        <w:t xml:space="preserve">stays unchanged; a move to another site needs an explicit metadata update in the application’s workflow.</w:t>
+      </w:r>
+    </w:p>
+    <w:p>
+      <w:pPr>
+        <w:pStyle w:val="BodyText"/>
+      </w:pPr>
+      <w:r>
         <w:t xml:space="preserve">Do not equate an SMS acknowledgment with confirmation of a held booking, or mutate only</w:t>
       </w:r>
       <w:r>
@@ -5214,9 +5469,9 @@
         <w:t xml:space="preserve">to reschedule while leaving its Slots behind. Notify dependent systems whenever the time, actors, or status changes.</w:t>
       </w:r>
     </w:p>
-    <w:bookmarkEnd w:id="50"/>
-    <w:bookmarkEnd w:id="51"/>
-    <w:bookmarkStart w:id="59" w:name="conditional-workflows"/>
+    <w:bookmarkEnd w:id="40"/>
+    <w:bookmarkEnd w:id="41"/>
+    <w:bookmarkStart w:id="49" w:name="conditional-workflows"/>
     <w:p>
       <w:pPr>
         <w:pStyle w:val="Heading3"/>
@@ -5225,7 +5480,7 @@
         <w:t xml:space="preserve">Conditional Workflows</w:t>
       </w:r>
     </w:p>
-    <w:bookmarkStart w:id="52" w:name="recurring-appointment-series"/>
+    <w:bookmarkStart w:id="42" w:name="recurring-appointment-series"/>
     <w:p>
       <w:pPr>
         <w:pStyle w:val="Heading4"/>
@@ -5248,55 +5503,55 @@
       </w:pPr>
       <w:r>
         <w:rPr>
+          <w:b/>
           <w:bCs/>
-          <w:b/>
         </w:rPr>
         <w:t xml:space="preserve">Questions:</w:t>
       </w:r>
     </w:p>
     <w:p>
       <w:pPr>
+        <w:pStyle w:val="Compact"/>
         <w:numPr>
           <w:ilvl w:val="0"/>
           <w:numId w:val="1015"/>
         </w:numPr>
+      </w:pPr>
+      <w:r>
+        <w:t xml:space="preserve">Is the series finite, or maintained over a rolling horizon?</w:t>
+      </w:r>
+    </w:p>
+    <w:p>
+      <w:pPr>
         <w:pStyle w:val="Compact"/>
-      </w:pPr>
-      <w:r>
-        <w:t xml:space="preserve">Is the series finite, or maintained over a rolling horizon?</w:t>
-      </w:r>
-    </w:p>
-    <w:p>
-      <w:pPr>
         <w:numPr>
           <w:ilvl w:val="0"/>
           <w:numId w:val="1015"/>
         </w:numPr>
+      </w:pPr>
+      <w:r>
+        <w:t xml:space="preserve">Must every occurrence be available before the series is accepted?</w:t>
+      </w:r>
+    </w:p>
+    <w:p>
+      <w:pPr>
         <w:pStyle w:val="Compact"/>
-      </w:pPr>
-      <w:r>
-        <w:t xml:space="preserve">Must every occurrence be available before the series is accepted?</w:t>
-      </w:r>
-    </w:p>
-    <w:p>
-      <w:pPr>
         <w:numPr>
           <w:ilvl w:val="0"/>
           <w:numId w:val="1015"/>
         </w:numPr>
+      </w:pPr>
+      <w:r>
+        <w:t xml:space="preserve">Can a user change one occurrence, all future occurrences, or the entire series?</w:t>
+      </w:r>
+    </w:p>
+    <w:p>
+      <w:pPr>
         <w:pStyle w:val="Compact"/>
-      </w:pPr>
-      <w:r>
-        <w:t xml:space="preserve">Can a user change one occurrence, all future occurrences, or the entire series?</w:t>
-      </w:r>
-    </w:p>
-    <w:p>
-      <w:pPr>
         <w:numPr>
           <w:ilvl w:val="0"/>
           <w:numId w:val="1015"/>
         </w:numPr>
-        <w:pStyle w:val="Compact"/>
       </w:pPr>
       <w:r>
         <w:t xml:space="preserve">Does recurrence follow local wall-clock time across DST changes?</w:t>
@@ -5306,9 +5561,8 @@
       <w:tblPr>
         <w:tblStyle w:val="Table"/>
         <w:tblW w:w="9360" w:type="dxa"/>
+        <w:tblLayout w:type="fixed"/>
         <w:tblLook w:firstRow="1" w:lastRow="0" w:firstColumn="0" w:lastColumn="0" w:noHBand="0" w:noVBand="0" w:val="0020"/>
-        <w:jc w:val="start"/>
-        <w:tblLayout w:type="fixed"/>
       </w:tblPr>
       <w:tblGrid>
         <w:gridCol w:w="4499"/>
@@ -5317,7 +5571,7 @@
       <w:tr>
         <w:trPr>
           <w:cantSplit/>
-          <w:tblHeader w:val="true"/>
+          <w:tblHeader w:val="on"/>
         </w:trPr>
         <w:tc>
           <w:tcPr/>
@@ -5523,8 +5777,8 @@
         <w:t xml:space="preserve">. Recheck the scheduling API’s supported series behavior before implementing a custom model, since this area is evolving.</w:t>
       </w:r>
     </w:p>
-    <w:bookmarkEnd w:id="52"/>
-    <w:bookmarkStart w:id="53" w:name="waitlists"/>
+    <w:bookmarkEnd w:id="42"/>
+    <w:bookmarkStart w:id="43" w:name="waitlists"/>
     <w:p>
       <w:pPr>
         <w:pStyle w:val="Heading4"/>
@@ -5547,43 +5801,43 @@
       </w:pPr>
       <w:r>
         <w:rPr>
+          <w:b/>
           <w:bCs/>
-          <w:b/>
         </w:rPr>
         <w:t xml:space="preserve">Questions:</w:t>
       </w:r>
     </w:p>
     <w:p>
       <w:pPr>
+        <w:pStyle w:val="Compact"/>
         <w:numPr>
           <w:ilvl w:val="0"/>
           <w:numId w:val="1016"/>
         </w:numPr>
+      </w:pPr>
+      <w:r>
+        <w:t xml:space="preserve">What service, candidates, time range, and preferences does the patient accept?</w:t>
+      </w:r>
+    </w:p>
+    <w:p>
+      <w:pPr>
         <w:pStyle w:val="Compact"/>
-      </w:pPr>
-      <w:r>
-        <w:t xml:space="preserve">What service, candidates, time range, and preferences does the patient accept?</w:t>
-      </w:r>
-    </w:p>
-    <w:p>
-      <w:pPr>
         <w:numPr>
           <w:ilvl w:val="0"/>
           <w:numId w:val="1016"/>
         </w:numPr>
+      </w:pPr>
+      <w:r>
+        <w:t xml:space="preserve">How are priority and fairness determined?</w:t>
+      </w:r>
+    </w:p>
+    <w:p>
+      <w:pPr>
         <w:pStyle w:val="Compact"/>
-      </w:pPr>
-      <w:r>
-        <w:t xml:space="preserve">How are priority and fairness determined?</w:t>
-      </w:r>
-    </w:p>
-    <w:p>
-      <w:pPr>
         <w:numPr>
           <w:ilvl w:val="0"/>
           <w:numId w:val="1016"/>
         </w:numPr>
-        <w:pStyle w:val="Compact"/>
       </w:pPr>
       <w:r>
         <w:t xml:space="preserve">How long is an offer valid, and does it reserve capacity?</w:t>
@@ -5593,9 +5847,8 @@
       <w:tblPr>
         <w:tblStyle w:val="Table"/>
         <w:tblW w:w="9360" w:type="dxa"/>
+        <w:tblLayout w:type="fixed"/>
         <w:tblLook w:firstRow="1" w:lastRow="0" w:firstColumn="0" w:lastColumn="0" w:noHBand="0" w:noVBand="0" w:val="0020"/>
-        <w:jc w:val="start"/>
-        <w:tblLayout w:type="fixed"/>
       </w:tblPr>
       <w:tblGrid>
         <w:gridCol w:w="3648"/>
@@ -5604,7 +5857,7 @@
       <w:tr>
         <w:trPr>
           <w:cantSplit/>
-          <w:tblHeader w:val="true"/>
+          <w:tblHeader w:val="on"/>
         </w:trPr>
         <w:tc>
           <w:tcPr/>
@@ -5775,8 +6028,8 @@
         </w:tc>
       </w:tr>
     </w:tbl>
-    <w:bookmarkEnd w:id="53"/>
-    <w:bookmarkStart w:id="55" w:name="reminders-and-responses"/>
+    <w:bookmarkEnd w:id="43"/>
+    <w:bookmarkStart w:id="45" w:name="reminders-and-responses"/>
     <w:p>
       <w:pPr>
         <w:pStyle w:val="Heading4"/>
@@ -5799,43 +6052,43 @@
       </w:pPr>
       <w:r>
         <w:rPr>
+          <w:b/>
           <w:bCs/>
-          <w:b/>
         </w:rPr>
         <w:t xml:space="preserve">Questions:</w:t>
       </w:r>
     </w:p>
     <w:p>
       <w:pPr>
+        <w:pStyle w:val="Compact"/>
         <w:numPr>
           <w:ilvl w:val="0"/>
           <w:numId w:val="1017"/>
         </w:numPr>
+      </w:pPr>
+      <w:r>
+        <w:t xml:space="preserve">Which channels and timing rules apply, and in whose time zone?</w:t>
+      </w:r>
+    </w:p>
+    <w:p>
+      <w:pPr>
         <w:pStyle w:val="Compact"/>
-      </w:pPr>
-      <w:r>
-        <w:t xml:space="preserve">Which channels and timing rules apply, and in whose time zone?</w:t>
-      </w:r>
-    </w:p>
-    <w:p>
-      <w:pPr>
         <w:numPr>
           <w:ilvl w:val="0"/>
           <w:numId w:val="1017"/>
         </w:numPr>
+      </w:pPr>
+      <w:r>
+        <w:t xml:space="preserve">Can replies acknowledge, cancel, or request a change?</w:t>
+      </w:r>
+    </w:p>
+    <w:p>
+      <w:pPr>
         <w:pStyle w:val="Compact"/>
-      </w:pPr>
-      <w:r>
-        <w:t xml:space="preserve">Can replies acknowledge, cancel, or request a change?</w:t>
-      </w:r>
-    </w:p>
-    <w:p>
-      <w:pPr>
         <w:numPr>
           <w:ilvl w:val="0"/>
           <w:numId w:val="1017"/>
         </w:numPr>
-        <w:pStyle w:val="Compact"/>
       </w:pPr>
       <w:r>
         <w:t xml:space="preserve">How are reminders suppressed after cancellation or rescheduling?</w:t>
@@ -5845,9 +6098,8 @@
       <w:tblPr>
         <w:tblStyle w:val="Table"/>
         <w:tblW w:w="9360" w:type="dxa"/>
+        <w:tblLayout w:type="fixed"/>
         <w:tblLook w:firstRow="1" w:lastRow="0" w:firstColumn="0" w:lastColumn="0" w:noHBand="0" w:noVBand="0" w:val="0020"/>
-        <w:jc w:val="start"/>
-        <w:tblLayout w:type="fixed"/>
       </w:tblPr>
       <w:tblGrid>
         <w:gridCol w:w="3899"/>
@@ -5856,7 +6108,7 @@
       <w:tr>
         <w:trPr>
           <w:cantSplit/>
-          <w:tblHeader w:val="true"/>
+          <w:tblHeader w:val="on"/>
         </w:trPr>
         <w:tc>
           <w:tcPr/>
@@ -5981,7 +6233,7 @@
       <w:r>
         <w:t xml:space="preserve"> </w:t>
       </w:r>
-      <w:hyperlink r:id="rId54">
+      <w:hyperlink r:id="rId44">
         <w:r>
           <w:rPr>
             <w:rStyle w:val="Hyperlink"/>
@@ -5996,8 +6248,8 @@
         <w:t xml:space="preserve">for channel, consent, and delivery design.</w:t>
       </w:r>
     </w:p>
-    <w:bookmarkEnd w:id="55"/>
-    <w:bookmarkStart w:id="56" w:name="telehealth-provisioning"/>
+    <w:bookmarkEnd w:id="45"/>
+    <w:bookmarkStart w:id="46" w:name="telehealth-provisioning"/>
     <w:p>
       <w:pPr>
         <w:pStyle w:val="Heading4"/>
@@ -6032,43 +6284,43 @@
       </w:pPr>
       <w:r>
         <w:rPr>
+          <w:b/>
           <w:bCs/>
-          <w:b/>
         </w:rPr>
         <w:t xml:space="preserve">Questions:</w:t>
       </w:r>
     </w:p>
     <w:p>
       <w:pPr>
+        <w:pStyle w:val="Compact"/>
         <w:numPr>
           <w:ilvl w:val="0"/>
           <w:numId w:val="1018"/>
         </w:numPr>
+      </w:pPr>
+      <w:r>
+        <w:t xml:space="preserve">Is the visit virtual, in-person, or selectable per booking?</w:t>
+      </w:r>
+    </w:p>
+    <w:p>
+      <w:pPr>
         <w:pStyle w:val="Compact"/>
-      </w:pPr>
-      <w:r>
-        <w:t xml:space="preserve">Is the visit virtual, in-person, or selectable per booking?</w:t>
-      </w:r>
-    </w:p>
-    <w:p>
-      <w:pPr>
         <w:numPr>
           <w:ilvl w:val="0"/>
           <w:numId w:val="1018"/>
         </w:numPr>
+      </w:pPr>
+      <w:r>
+        <w:t xml:space="preserve">Is the meeting created at booking, approval, or shortly before the visit?</w:t>
+      </w:r>
+    </w:p>
+    <w:p>
+      <w:pPr>
         <w:pStyle w:val="Compact"/>
-      </w:pPr>
-      <w:r>
-        <w:t xml:space="preserve">Is the meeting created at booking, approval, or shortly before the visit?</w:t>
-      </w:r>
-    </w:p>
-    <w:p>
-      <w:pPr>
         <w:numPr>
           <w:ilvl w:val="0"/>
           <w:numId w:val="1018"/>
         </w:numPr>
-        <w:pStyle w:val="Compact"/>
       </w:pPr>
       <w:r>
         <w:t xml:space="preserve">Who can read the join details, and what happens when the visit changes?</w:t>
@@ -6078,9 +6330,8 @@
       <w:tblPr>
         <w:tblStyle w:val="Table"/>
         <w:tblW w:w="9360" w:type="dxa"/>
+        <w:tblLayout w:type="fixed"/>
         <w:tblLook w:firstRow="1" w:lastRow="0" w:firstColumn="0" w:lastColumn="0" w:noHBand="0" w:noVBand="0" w:val="0020"/>
-        <w:jc w:val="start"/>
-        <w:tblLayout w:type="fixed"/>
       </w:tblPr>
       <w:tblGrid>
         <w:gridCol w:w="4513"/>
@@ -6089,7 +6340,7 @@
       <w:tr>
         <w:trPr>
           <w:cantSplit/>
-          <w:tblHeader w:val="true"/>
+          <w:tblHeader w:val="on"/>
         </w:trPr>
         <w:tc>
           <w:tcPr/>
@@ -6233,8 +6484,8 @@
         </w:tc>
       </w:tr>
     </w:tbl>
-    <w:bookmarkEnd w:id="56"/>
-    <w:bookmarkStart w:id="58" w:name="external-calendar-integration"/>
+    <w:bookmarkEnd w:id="46"/>
+    <w:bookmarkStart w:id="48" w:name="external-calendar-integration"/>
     <w:p>
       <w:pPr>
         <w:pStyle w:val="Heading4"/>
@@ -6257,43 +6508,43 @@
       </w:pPr>
       <w:r>
         <w:rPr>
+          <w:b/>
           <w:bCs/>
-          <w:b/>
         </w:rPr>
         <w:t xml:space="preserve">Questions:</w:t>
       </w:r>
     </w:p>
     <w:p>
       <w:pPr>
+        <w:pStyle w:val="Compact"/>
         <w:numPr>
           <w:ilvl w:val="0"/>
           <w:numId w:val="1019"/>
         </w:numPr>
+      </w:pPr>
+      <w:r>
+        <w:t xml:space="preserve">Is the destination a personal calendar, patient calendar feed, or another clinical scheduler?</w:t>
+      </w:r>
+    </w:p>
+    <w:p>
+      <w:pPr>
         <w:pStyle w:val="Compact"/>
-      </w:pPr>
-      <w:r>
-        <w:t xml:space="preserve">Is the destination a personal calendar, patient calendar feed, or another clinical scheduler?</w:t>
-      </w:r>
-    </w:p>
-    <w:p>
-      <w:pPr>
         <w:numPr>
           <w:ilvl w:val="0"/>
           <w:numId w:val="1019"/>
         </w:numPr>
+      </w:pPr>
+      <w:r>
+        <w:t xml:space="preserve">Do external events block availability, and do edits move Medplum appointments?</w:t>
+      </w:r>
+    </w:p>
+    <w:p>
+      <w:pPr>
         <w:pStyle w:val="Compact"/>
-      </w:pPr>
-      <w:r>
-        <w:t xml:space="preserve">Do external events block availability, and do edits move Medplum appointments?</w:t>
-      </w:r>
-    </w:p>
-    <w:p>
-      <w:pPr>
         <w:numPr>
           <w:ilvl w:val="0"/>
           <w:numId w:val="1019"/>
         </w:numPr>
-        <w:pStyle w:val="Compact"/>
       </w:pPr>
       <w:r>
         <w:t xml:space="preserve">How are cancellations, recurrence exceptions, outages, and reconciliation handled?</w:t>
@@ -6303,9 +6554,8 @@
       <w:tblPr>
         <w:tblStyle w:val="Table"/>
         <w:tblW w:w="9360" w:type="dxa"/>
+        <w:tblLayout w:type="fixed"/>
         <w:tblLook w:firstRow="1" w:lastRow="0" w:firstColumn="0" w:lastColumn="0" w:noHBand="0" w:noVBand="0" w:val="0020"/>
-        <w:jc w:val="start"/>
-        <w:tblLayout w:type="fixed"/>
       </w:tblPr>
       <w:tblGrid>
         <w:gridCol w:w="4315"/>
@@ -6314,7 +6564,7 @@
       <w:tr>
         <w:trPr>
           <w:cantSplit/>
-          <w:tblHeader w:val="true"/>
+          <w:tblHeader w:val="on"/>
         </w:trPr>
         <w:tc>
           <w:tcPr/>
@@ -6483,7 +6733,7 @@
       <w:r>
         <w:t xml:space="preserve"> </w:t>
       </w:r>
-      <w:hyperlink r:id="rId57">
+      <w:hyperlink r:id="rId47">
         <w:r>
           <w:rPr>
             <w:rStyle w:val="Hyperlink"/>
@@ -6498,10 +6748,10 @@
         <w:t xml:space="preserve">when replacing or running alongside another scheduler.</w:t>
       </w:r>
     </w:p>
-    <w:bookmarkEnd w:id="58"/>
-    <w:bookmarkEnd w:id="59"/>
-    <w:bookmarkEnd w:id="60"/>
-    <w:bookmarkStart w:id="63" w:name="reference-implementation"/>
+    <w:bookmarkEnd w:id="48"/>
+    <w:bookmarkEnd w:id="49"/>
+    <w:bookmarkEnd w:id="50"/>
+    <w:bookmarkStart w:id="53" w:name="reference-implementation"/>
     <w:p>
       <w:pPr>
         <w:pStyle w:val="Heading2"/>
@@ -6520,7 +6770,7 @@
       <w:r>
         <w:t xml:space="preserve"> </w:t>
       </w:r>
-      <w:hyperlink r:id="rId61">
+      <w:hyperlink r:id="rId51">
         <w:r>
           <w:rPr>
             <w:rStyle w:val="VerbatimChar"/>
@@ -6534,7 +6784,7 @@
       <w:r>
         <w:t xml:space="preserve"> </w:t>
       </w:r>
-      <w:hyperlink r:id="rId62">
+      <w:hyperlink r:id="rId52">
         <w:r>
           <w:rPr>
             <w:rStyle w:val="Hyperlink"/>
@@ -6546,8 +6796,8 @@
         <w:t xml:space="preserve">.</w:t>
       </w:r>
     </w:p>
-    <w:bookmarkEnd w:id="63"/>
-    <w:bookmarkStart w:id="64" w:name="before-you-implement"/>
+    <w:bookmarkEnd w:id="53"/>
+    <w:bookmarkStart w:id="54" w:name="before-you-implement"/>
     <w:p>
       <w:pPr>
         <w:pStyle w:val="Heading2"/>
@@ -6558,78 +6808,78 @@
     </w:p>
     <w:p>
       <w:pPr>
+        <w:pStyle w:val="Compact"/>
         <w:numPr>
           <w:ilvl w:val="0"/>
           <w:numId w:val="1020"/>
         </w:numPr>
+      </w:pPr>
+      <w:r>
+        <w:t xml:space="preserve">Record the chosen service, actor, availability, and access models, with an owner for each.</w:t>
+      </w:r>
+    </w:p>
+    <w:p>
+      <w:pPr>
         <w:pStyle w:val="Compact"/>
-      </w:pPr>
-      <w:r>
-        <w:t xml:space="preserve">Record the chosen service, actor, availability, and access models, with an owner for each.</w:t>
-      </w:r>
-    </w:p>
-    <w:p>
-      <w:pPr>
         <w:numPr>
           <w:ilvl w:val="0"/>
           <w:numId w:val="1020"/>
         </w:numPr>
+      </w:pPr>
+      <w:r>
+        <w:t xml:space="preserve">Separate server-supported behavior from custom workflows and unresolved product requirements.</w:t>
+      </w:r>
+    </w:p>
+    <w:p>
+      <w:pPr>
         <w:pStyle w:val="Compact"/>
-      </w:pPr>
-      <w:r>
-        <w:t xml:space="preserve">Separate server-supported behavior from custom workflows and unresolved product requirements.</w:t>
-      </w:r>
-    </w:p>
-    <w:p>
-      <w:pPr>
         <w:numPr>
           <w:ilvl w:val="0"/>
           <w:numId w:val="1020"/>
         </w:numPr>
+      </w:pPr>
+      <w:r>
+        <w:t xml:space="preserve">Test booking conflicts, capacity and buffers, time zones, expiry/cancellation races, and denied access using representative user roles.</w:t>
+      </w:r>
+    </w:p>
+    <w:p>
+      <w:pPr>
         <w:pStyle w:val="Compact"/>
-      </w:pPr>
-      <w:r>
-        <w:t xml:space="preserve">Test booking conflicts, capacity and buffers, time zones, expiry/cancellation races, and denied access using representative user roles.</w:t>
-      </w:r>
-    </w:p>
-    <w:p>
-      <w:pPr>
         <w:numPr>
           <w:ilvl w:val="0"/>
           <w:numId w:val="1020"/>
         </w:numPr>
+      </w:pPr>
+      <w:r>
+        <w:t xml:space="preserve">Define recovery for partial series bookings, failed integrations, and ambiguous responses.</w:t>
+      </w:r>
+    </w:p>
+    <w:p>
+      <w:pPr>
         <w:pStyle w:val="Compact"/>
-      </w:pPr>
-      <w:r>
-        <w:t xml:space="preserve">Define recovery for partial series bookings, failed integrations, and ambiguous responses.</w:t>
-      </w:r>
-    </w:p>
-    <w:p>
-      <w:pPr>
         <w:numPr>
           <w:ilvl w:val="0"/>
           <w:numId w:val="1020"/>
         </w:numPr>
+      </w:pPr>
+      <w:r>
+        <w:t xml:space="preserve">Confirm the server/package versions in use and review the scheduling beta changelog before launch or upgrade.</w:t>
+      </w:r>
+    </w:p>
+    <w:p>
+      <w:pPr>
         <w:pStyle w:val="Compact"/>
-      </w:pPr>
-      <w:r>
-        <w:t xml:space="preserve">Confirm the server/package versions in use and review the scheduling beta changelog before launch or upgrade.</w:t>
-      </w:r>
-    </w:p>
-    <w:p>
-      <w:pPr>
         <w:numPr>
           <w:ilvl w:val="0"/>
           <w:numId w:val="1020"/>
         </w:numPr>
-        <w:pStyle w:val="Compact"/>
       </w:pPr>
       <w:r>
         <w:t xml:space="preserve">Assign an owner and acceptance criteria to every Not sure answer and every custom scheduling rule.</w:t>
       </w:r>
     </w:p>
-    <w:bookmarkEnd w:id="64"/>
-    <w:bookmarkEnd w:id="65"/>
+    <w:bookmarkEnd w:id="54"/>
+    <w:bookmarkEnd w:id="55"/>
     <w:sectPr>
       <w:pgSz w:h="15840" w:w="12240"/>
       <w:pgMar w:bottom="1440" w:footer="720" w:gutter="0" w:header="720" w:left="1440" w:right="1440" w:top="1440"/>
@@ -6667,14 +6917,14 @@
 <file path=word/numbering.xml><?xml version="1.0" encoding="utf-8"?>
 <w:numbering xmlns:w="http://schemas.openxmlformats.org/wordprocessingml/2006/main">
   <w:abstractNum w:abstractNumId="990">
-    <w:nsid w:val="A990"/>
+    <w:nsid w:val="0000A990"/>
     <w:multiLevelType w:val="multilevel"/>
     <w:lvl w:ilvl="0">
       <w:numFmt w:val="bullet"/>
       <w:lvlText w:val=" "/>
       <w:lvlJc w:val="left"/>
       <w:pPr>
-        <w:ind w:left="720" w:hanging="480"/>
+        <w:ind w:left="720" w:hanging="360"/>
       </w:pPr>
     </w:lvl>
     <w:lvl w:ilvl="1">
@@ -6682,7 +6932,7 @@
       <w:lvlText w:val=" "/>
       <w:lvlJc w:val="left"/>
       <w:pPr>
-        <w:ind w:left="1440" w:hanging="480"/>
+        <w:ind w:left="1440" w:hanging="360"/>
       </w:pPr>
     </w:lvl>
     <w:lvl w:ilvl="2">
@@ -6690,7 +6940,7 @@
       <w:lvlText w:val=" "/>
       <w:lvlJc w:val="left"/>
       <w:pPr>
-        <w:ind w:left="2160" w:hanging="480"/>
+        <w:ind w:left="2160" w:hanging="360"/>
       </w:pPr>
     </w:lvl>
     <w:lvl w:ilvl="3">
@@ -6698,7 +6948,7 @@
       <w:lvlText w:val=" "/>
       <w:lvlJc w:val="left"/>
       <w:pPr>
-        <w:ind w:left="2880" w:hanging="480"/>
+        <w:ind w:left="2880" w:hanging="360"/>
       </w:pPr>
     </w:lvl>
     <w:lvl w:ilvl="4">
@@ -6706,7 +6956,7 @@
       <w:lvlText w:val=" "/>
       <w:lvlJc w:val="left"/>
       <w:pPr>
-        <w:ind w:left="3600" w:hanging="480"/>
+        <w:ind w:left="3600" w:hanging="360"/>
       </w:pPr>
     </w:lvl>
     <w:lvl w:ilvl="5">
@@ -6714,7 +6964,7 @@
       <w:lvlText w:val=" "/>
       <w:lvlJc w:val="left"/>
       <w:pPr>
-        <w:ind w:left="4320" w:hanging="480"/>
+        <w:ind w:left="4320" w:hanging="360"/>
       </w:pPr>
     </w:lvl>
     <w:lvl w:ilvl="6">
@@ -6722,7 +6972,7 @@
       <w:lvlText w:val=" "/>
       <w:lvlJc w:val="left"/>
       <w:pPr>
-        <w:ind w:left="5040" w:hanging="480"/>
+        <w:ind w:left="5040" w:hanging="360"/>
       </w:pPr>
     </w:lvl>
     <w:lvl w:ilvl="7">
@@ -6730,7 +6980,7 @@
       <w:lvlText w:val=" "/>
       <w:lvlJc w:val="left"/>
       <w:pPr>
-        <w:ind w:left="5760" w:hanging="480"/>
+        <w:ind w:left="5760" w:hanging="360"/>
       </w:pPr>
     </w:lvl>
     <w:lvl w:ilvl="8">
@@ -6738,84 +6988,111 @@
       <w:lvlText w:val=" "/>
       <w:lvlJc w:val="left"/>
       <w:pPr>
-        <w:ind w:left="6480" w:hanging="480"/>
+        <w:ind w:left="6480" w:hanging="360"/>
       </w:pPr>
     </w:lvl>
   </w:abstractNum>
   <w:abstractNum w:abstractNumId="991">
-    <w:nsid w:val="A991"/>
+    <w:nsid w:val="0000A991"/>
     <w:multiLevelType w:val="multilevel"/>
     <w:lvl w:ilvl="0">
       <w:numFmt w:val="bullet"/>
-      <w:lvlText w:val="•"/>
+      <w:lvlText w:val=""/>
       <w:lvlJc w:val="left"/>
       <w:pPr>
-        <w:ind w:left="720" w:hanging="480"/>
-      </w:pPr>
+        <w:ind w:left="720" w:hanging="360"/>
+      </w:pPr>
+      <w:rPr>
+        <w:rFonts w:ascii="Symbol" w:hAnsi="Symbol" w:cs="Symbol" w:hint="default"/>
+      </w:rPr>
     </w:lvl>
     <w:lvl w:ilvl="1">
       <w:numFmt w:val="bullet"/>
-      <w:lvlText w:val="–"/>
+      <w:lvlText w:val="o"/>
       <w:lvlJc w:val="left"/>
       <w:pPr>
-        <w:ind w:left="1440" w:hanging="480"/>
-      </w:pPr>
+        <w:ind w:left="1440" w:hanging="360"/>
+      </w:pPr>
+      <w:rPr>
+        <w:rFonts w:ascii="Courier New" w:hAnsi="Courier New" w:cs="Courier New" w:hint="default"/>
+      </w:rPr>
     </w:lvl>
     <w:lvl w:ilvl="2">
       <w:numFmt w:val="bullet"/>
-      <w:lvlText w:val="•"/>
+      <w:lvlText w:val=""/>
       <w:lvlJc w:val="left"/>
       <w:pPr>
-        <w:ind w:left="2160" w:hanging="480"/>
-      </w:pPr>
+        <w:ind w:left="2160" w:hanging="360"/>
+      </w:pPr>
+      <w:rPr>
+        <w:rFonts w:ascii="Wingdings" w:hAnsi="Wingdings" w:cs="Wingdings" w:hint="default"/>
+      </w:rPr>
     </w:lvl>
     <w:lvl w:ilvl="3">
       <w:numFmt w:val="bullet"/>
-      <w:lvlText w:val="–"/>
+      <w:lvlText w:val=""/>
       <w:lvlJc w:val="left"/>
       <w:pPr>
-        <w:ind w:left="2880" w:hanging="480"/>
-      </w:pPr>
+        <w:ind w:left="2880" w:hanging="360"/>
+      </w:pPr>
+      <w:rPr>
+        <w:rFonts w:ascii="Symbol" w:hAnsi="Symbol" w:cs="Symbol" w:hint="default"/>
+      </w:rPr>
     </w:lvl>
     <w:lvl w:ilvl="4">
       <w:numFmt w:val="bullet"/>
-      <w:lvlText w:val="•"/>
+      <w:lvlText w:val="o"/>
       <w:lvlJc w:val="left"/>
       <w:pPr>
-        <w:ind w:left="3600" w:hanging="480"/>
-      </w:pPr>
+        <w:ind w:left="3600" w:hanging="360"/>
+      </w:pPr>
+      <w:rPr>
+        <w:rFonts w:ascii="Courier New" w:hAnsi="Courier New" w:cs="Courier New" w:hint="default"/>
+      </w:rPr>
     </w:lvl>
     <w:lvl w:ilvl="5">
       <w:numFmt w:val="bullet"/>
-      <w:lvlText w:val="–"/>
+      <w:lvlText w:val=""/>
       <w:lvlJc w:val="left"/>
       <w:pPr>
-        <w:ind w:left="4320" w:hanging="480"/>
-      </w:pPr>
+        <w:ind w:left="4320" w:hanging="360"/>
+      </w:pPr>
+      <w:rPr>
+        <w:rFonts w:ascii="Wingdings" w:hAnsi="Wingdings" w:cs="Wingdings" w:hint="default"/>
+      </w:rPr>
     </w:lvl>
     <w:lvl w:ilvl="6">
       <w:numFmt w:val="bullet"/>
-      <w:lvlText w:val="•"/>
+      <w:lvlText w:val=""/>
       <w:lvlJc w:val="left"/>
       <w:pPr>
-        <w:ind w:left="5040" w:hanging="480"/>
-      </w:pPr>
+        <w:ind w:left="5040" w:hanging="360"/>
+      </w:pPr>
+      <w:rPr>
+        <w:rFonts w:ascii="Symbol" w:hAnsi="Symbol" w:cs="Symbol" w:hint="default"/>
+      </w:rPr>
     </w:lvl>
     <w:lvl w:ilvl="7">
       <w:numFmt w:val="bullet"/>
-      <w:lvlText w:val="–"/>
+      <w:lvlText w:val="o"/>
       <w:lvlJc w:val="left"/>
       <w:pPr>
-        <w:ind w:left="5760" w:hanging="480"/>
-      </w:pPr>
+        <w:ind w:left="5760" w:hanging="360"/>
+      </w:pPr>
+      <w:rPr>
+        <w:rFonts w:ascii="Courier New" w:hAnsi="Courier New" w:cs="Courier New" w:hint="default"/>
+      </w:rPr>
     </w:lvl>
     <w:lvl w:ilvl="8">
       <w:numFmt w:val="bullet"/>
-      <w:lvlText w:val="•"/>
+      <w:lvlText w:val=""/>
       <w:lvlJc w:val="left"/>
       <w:pPr>
-        <w:ind w:left="6480" w:hanging="480"/>
-      </w:pPr>
+        <w:ind w:left="6480" w:hanging="360"/>
+      </w:pPr>
+      <w:rPr>
+        <w:rFonts w:ascii="Wingdings" w:hAnsi="Wingdings" w:cs="Wingdings" w:hint="default"/>
+      </w:rPr>
     </w:lvl>
   </w:abstractNum>
   <w:num w:numId="1000">
@@ -7560,8 +7837,8 @@
     <w:name w:val="KeywordTok"/>
     <w:basedOn w:val="VerbatimChar"/>
     <w:rPr>
+      <w:b/>
       <w:color w:val="007020"/>
-      <w:b/>
     </w:rPr>
   </w:style>
   <w:style w:type="character" w:customStyle="1" w:styleId="DataTypeTok">
@@ -7638,42 +7915,42 @@
     <w:name w:val="ImportTok"/>
     <w:basedOn w:val="VerbatimChar"/>
     <w:rPr>
+      <w:b/>
       <w:color w:val="008000"/>
-      <w:b/>
     </w:rPr>
   </w:style>
   <w:style w:type="character" w:customStyle="1" w:styleId="CommentTok">
     <w:name w:val="CommentTok"/>
     <w:basedOn w:val="VerbatimChar"/>
     <w:rPr>
+      <w:i/>
       <w:color w:val="60a0b0"/>
-      <w:i/>
     </w:rPr>
   </w:style>
   <w:style w:type="character" w:customStyle="1" w:styleId="DocumentationTok">
     <w:name w:val="DocumentationTok"/>
     <w:basedOn w:val="VerbatimChar"/>
     <w:rPr>
+      <w:i/>
       <w:color w:val="ba2121"/>
-      <w:i/>
     </w:rPr>
   </w:style>
   <w:style w:type="character" w:customStyle="1" w:styleId="AnnotationTok">
     <w:name w:val="AnnotationTok"/>
     <w:basedOn w:val="VerbatimChar"/>
     <w:rPr>
-      <w:color w:val="60a0b0"/>
       <w:b/>
       <w:i/>
+      <w:color w:val="60a0b0"/>
     </w:rPr>
   </w:style>
   <w:style w:type="character" w:customStyle="1" w:styleId="CommentVarTok">
     <w:name w:val="CommentVarTok"/>
     <w:basedOn w:val="VerbatimChar"/>
     <w:rPr>
-      <w:color w:val="60a0b0"/>
       <w:b/>
       <w:i/>
+      <w:color w:val="60a0b0"/>
     </w:rPr>
   </w:style>
   <w:style w:type="character" w:customStyle="1" w:styleId="OtherTok">
@@ -7701,8 +7978,8 @@
     <w:name w:val="ControlFlowTok"/>
     <w:basedOn w:val="VerbatimChar"/>
     <w:rPr>
+      <w:b/>
       <w:color w:val="007020"/>
-      <w:b/>
     </w:rPr>
   </w:style>
   <w:style w:type="character" w:customStyle="1" w:styleId="OperatorTok">
@@ -7747,34 +8024,34 @@
     <w:name w:val="InformationTok"/>
     <w:basedOn w:val="VerbatimChar"/>
     <w:rPr>
-      <w:color w:val="60a0b0"/>
       <w:b/>
       <w:i/>
+      <w:color w:val="60a0b0"/>
     </w:rPr>
   </w:style>
   <w:style w:type="character" w:customStyle="1" w:styleId="WarningTok">
     <w:name w:val="WarningTok"/>
     <w:basedOn w:val="VerbatimChar"/>
     <w:rPr>
-      <w:color w:val="60a0b0"/>
       <w:b/>
       <w:i/>
+      <w:color w:val="60a0b0"/>
     </w:rPr>
   </w:style>
   <w:style w:type="character" w:customStyle="1" w:styleId="AlertTok">
     <w:name w:val="AlertTok"/>
     <w:basedOn w:val="VerbatimChar"/>
     <w:rPr>
+      <w:b/>
       <w:color w:val="ff0000"/>
-      <w:b/>
     </w:rPr>
   </w:style>
   <w:style w:type="character" w:customStyle="1" w:styleId="ErrorTok">
     <w:name w:val="ErrorTok"/>
     <w:basedOn w:val="VerbatimChar"/>
     <w:rPr>
+      <w:b/>
       <w:color w:val="ff0000"/>
-      <w:b/>
     </w:rPr>
   </w:style>
   <w:style w:type="character" w:customStyle="1" w:styleId="NormalTok">

</xml_diff>